<commit_message>
Agregar documentación de dependencias al documento WBS
</commit_message>
<xml_diff>
--- a/WBS_Biblioteca_Escolar.docx
+++ b/WBS_Biblioteca_Escolar.docx
@@ -3662,6 +3662,2852 @@
         </w:rPr>
       </w:r>
     </w:p>
+    <w:p xmlns:w="http://schemas.openxmlformats.org/wordprocessingml/2006/main" xmlns:wpc="http://schemas.microsoft.com/office/word/2010/wordprocessingCanvas" xmlns:mo="http://schemas.microsoft.com/office/mac/office/2008/main" xmlns:mc="http://schemas.openxmlformats.org/markup-compatibility/2006" xmlns:mv="urn:schemas-microsoft-com:mac:vml" xmlns:o="urn:schemas-microsoft-com:office:office" xmlns:r="http://schemas.openxmlformats.org/officeDocument/2006/relationships" xmlns:m="http://schemas.openxmlformats.org/officeDocument/2006/math" xmlns:v="urn:schemas-microsoft-com:vml" xmlns:wp14="http://schemas.microsoft.com/office/word/2010/wordprocessingDrawing" xmlns:wp="http://schemas.openxmlformats.org/drawingml/2006/wordprocessingDrawing" xmlns:w10="urn:schemas-microsoft-com:office:word" xmlns:w14="http://schemas.microsoft.com/office/word/2010/wordml" xmlns:wpg="http://schemas.microsoft.com/office/word/2010/wordprocessingGroup" xmlns:wpi="http://schemas.microsoft.com/office/word/2010/wordprocessingInk" xmlns:wne="http://schemas.microsoft.com/office/word/2006/wordml" xmlns:wps="http://schemas.microsoft.com/office/word/2010/wordprocessingShape">
+      <w:pPr>
+        <w:keepNext/>
+        <w:pageBreakBefore/>
+        <w:spacing w:after="140" w:line="259" w:lineRule="auto" w:before="200"/>
+      </w:pPr>
+      <w:r>
+        <w:rPr>
+          <w:rFonts w:ascii="Calibri" w:hAnsi="Calibri"/>
+          <w:b/>
+          <w:color w:val="000000"/>
+          <w:sz w:val="28"/>
+        </w:rPr>
+        <w:t>5 Dependencias del proyecto</w:t>
+      </w:r>
+    </w:p>
+    <w:p xmlns:w="http://schemas.openxmlformats.org/wordprocessingml/2006/main" xmlns:wpc="http://schemas.microsoft.com/office/word/2010/wordprocessingCanvas" xmlns:mo="http://schemas.microsoft.com/office/mac/office/2008/main" xmlns:mc="http://schemas.openxmlformats.org/markup-compatibility/2006" xmlns:mv="urn:schemas-microsoft-com:mac:vml" xmlns:o="urn:schemas-microsoft-com:office:office" xmlns:r="http://schemas.openxmlformats.org/officeDocument/2006/relationships" xmlns:m="http://schemas.openxmlformats.org/officeDocument/2006/math" xmlns:v="urn:schemas-microsoft-com:vml" xmlns:wp14="http://schemas.microsoft.com/office/word/2010/wordprocessingDrawing" xmlns:wp="http://schemas.openxmlformats.org/drawingml/2006/wordprocessingDrawing" xmlns:w10="urn:schemas-microsoft-com:office:word" xmlns:w14="http://schemas.microsoft.com/office/word/2010/wordml" xmlns:wpg="http://schemas.microsoft.com/office/word/2010/wordprocessingGroup" xmlns:wpi="http://schemas.microsoft.com/office/word/2010/wordprocessingInk" xmlns:wne="http://schemas.microsoft.com/office/word/2006/wordml" xmlns:wps="http://schemas.microsoft.com/office/word/2010/wordprocessingShape">
+      <w:pPr>
+        <w:spacing w:after="140" w:line="259" w:lineRule="auto"/>
+      </w:pPr>
+      <w:r>
+        <w:rPr>
+          <w:rFonts w:ascii="Calibri" w:hAnsi="Calibri"/>
+          <w:b w:val="0"/>
+          <w:color w:val="000000"/>
+          <w:sz w:val="20"/>
+        </w:rPr>
+        <w:t>Actualización del 26 de octubre de 2026</w:t>
+      </w:r>
+    </w:p>
+    <w:p xmlns:w="http://schemas.openxmlformats.org/wordprocessingml/2006/main" xmlns:wpc="http://schemas.microsoft.com/office/word/2010/wordprocessingCanvas" xmlns:mo="http://schemas.microsoft.com/office/mac/office/2008/main" xmlns:mc="http://schemas.openxmlformats.org/markup-compatibility/2006" xmlns:mv="urn:schemas-microsoft-com:mac:vml" xmlns:o="urn:schemas-microsoft-com:office:office" xmlns:r="http://schemas.openxmlformats.org/officeDocument/2006/relationships" xmlns:m="http://schemas.openxmlformats.org/officeDocument/2006/math" xmlns:v="urn:schemas-microsoft-com:vml" xmlns:wp14="http://schemas.microsoft.com/office/word/2010/wordprocessingDrawing" xmlns:wp="http://schemas.openxmlformats.org/drawingml/2006/wordprocessingDrawing" xmlns:w10="urn:schemas-microsoft-com:office:word" xmlns:w14="http://schemas.microsoft.com/office/word/2010/wordml" xmlns:wpg="http://schemas.microsoft.com/office/word/2010/wordprocessingGroup" xmlns:wpi="http://schemas.microsoft.com/office/word/2010/wordprocessingInk" xmlns:wne="http://schemas.microsoft.com/office/word/2006/wordml" xmlns:wps="http://schemas.microsoft.com/office/word/2010/wordprocessingShape">
+      <w:pPr>
+        <w:spacing w:after="140" w:line="259" w:lineRule="auto"/>
+      </w:pPr>
+      <w:r>
+        <w:rPr>
+          <w:rFonts w:ascii="Calibri" w:hAnsi="Calibri"/>
+          <w:b w:val="0"/>
+          <w:color w:val="000000"/>
+          <w:sz w:val="21"/>
+        </w:rPr>
+        <w:t>Biblioteca Tec utiliza 15 dependencias directas: 8 para el backend, 3 para el frontend y 4 herramientas de desarrollo. Las siguientes versiones provienen de package.json y package-lock.json; no indican la última versión disponible en npm.</w:t>
+      </w:r>
+    </w:p>
+    <w:p xmlns:w="http://schemas.openxmlformats.org/wordprocessingml/2006/main" xmlns:wpc="http://schemas.microsoft.com/office/word/2010/wordprocessingCanvas" xmlns:mo="http://schemas.microsoft.com/office/mac/office/2008/main" xmlns:mc="http://schemas.openxmlformats.org/markup-compatibility/2006" xmlns:mv="urn:schemas-microsoft-com:mac:vml" xmlns:o="urn:schemas-microsoft-com:office:office" xmlns:r="http://schemas.openxmlformats.org/officeDocument/2006/relationships" xmlns:m="http://schemas.openxmlformats.org/officeDocument/2006/math" xmlns:v="urn:schemas-microsoft-com:vml" xmlns:wp14="http://schemas.microsoft.com/office/word/2010/wordprocessingDrawing" xmlns:wp="http://schemas.openxmlformats.org/drawingml/2006/wordprocessingDrawing" xmlns:w10="urn:schemas-microsoft-com:office:word" xmlns:w14="http://schemas.microsoft.com/office/word/2010/wordml" xmlns:wpg="http://schemas.microsoft.com/office/word/2010/wordprocessingGroup" xmlns:wpi="http://schemas.microsoft.com/office/word/2010/wordprocessingInk" xmlns:wne="http://schemas.microsoft.com/office/word/2006/wordml" xmlns:wps="http://schemas.microsoft.com/office/word/2010/wordprocessingShape">
+      <w:pPr>
+        <w:keepNext/>
+        <w:spacing w:after="140" w:line="259" w:lineRule="auto" w:before="200"/>
+      </w:pPr>
+      <w:r>
+        <w:rPr>
+          <w:rFonts w:ascii="Calibri" w:hAnsi="Calibri"/>
+          <w:b/>
+          <w:color w:val="000000"/>
+          <w:sz w:val="24"/>
+        </w:rPr>
+        <w:t>5 1 Backend</w:t>
+      </w:r>
+    </w:p>
+    <w:tbl xmlns:w="http://schemas.openxmlformats.org/wordprocessingml/2006/main" xmlns:wpc="http://schemas.microsoft.com/office/word/2010/wordprocessingCanvas" xmlns:mo="http://schemas.microsoft.com/office/mac/office/2008/main" xmlns:mc="http://schemas.openxmlformats.org/markup-compatibility/2006" xmlns:mv="urn:schemas-microsoft-com:mac:vml" xmlns:o="urn:schemas-microsoft-com:office:office" xmlns:r="http://schemas.openxmlformats.org/officeDocument/2006/relationships" xmlns:m="http://schemas.openxmlformats.org/officeDocument/2006/math" xmlns:v="urn:schemas-microsoft-com:vml" xmlns:wp14="http://schemas.microsoft.com/office/word/2010/wordprocessingDrawing" xmlns:wp="http://schemas.openxmlformats.org/drawingml/2006/wordprocessingDrawing" xmlns:w10="urn:schemas-microsoft-com:office:word" xmlns:w14="http://schemas.microsoft.com/office/word/2010/wordml" xmlns:wpg="http://schemas.microsoft.com/office/word/2010/wordprocessingGroup" xmlns:wpi="http://schemas.microsoft.com/office/word/2010/wordprocessingInk" xmlns:wne="http://schemas.microsoft.com/office/word/2006/wordml" xmlns:wps="http://schemas.microsoft.com/office/word/2010/wordprocessingShape">
+      <w:tblPr>
+        <w:tblW w:type="auto" w:w="0"/>
+        <w:tblLayout w:type="fixed"/>
+        <w:tblLook w:firstColumn="1" w:firstRow="1" w:lastColumn="0" w:lastRow="0" w:noHBand="0" w:noVBand="1" w:val="04A0"/>
+      </w:tblPr>
+      <w:tblGrid>
+        <w:gridCol w:w="2200"/>
+        <w:gridCol w:w="1300"/>
+        <w:gridCol w:w="1300"/>
+        <w:gridCol w:w="5500"/>
+      </w:tblGrid>
+      <w:tr>
+        <w:trPr>
+          <w:tblHeader/>
+          <w:cantSplit/>
+        </w:trPr>
+        <w:tc>
+          <w:tcPr>
+            <w:tcW w:type="dxa" w:w="2200"/>
+            <w:vAlign w:val="center"/>
+            <w:tcMar>
+              <w:top w:w="100" w:type="dxa"/>
+              <w:left w:w="100" w:type="dxa"/>
+              <w:bottom w:w="100" w:type="dxa"/>
+              <w:right w:w="100" w:type="dxa"/>
+            </w:tcMar>
+            <w:shd w:fill="16365C"/>
+            <w:tcBorders>
+              <w:top w:val="single" w:sz="4" w:color="D9D9D9"/>
+              <w:left w:val="single" w:sz="4" w:color="D9D9D9"/>
+              <w:bottom w:val="single" w:sz="4" w:color="D9D9D9"/>
+              <w:right w:val="single" w:sz="4" w:color="D9D9D9"/>
+            </w:tcBorders>
+          </w:tcPr>
+          <w:p>
+            <w:pPr>
+              <w:spacing w:after="40" w:line="252" w:lineRule="auto"/>
+            </w:pPr>
+            <w:r>
+              <w:rPr>
+                <w:rFonts w:ascii="Calibri" w:hAnsi="Calibri"/>
+                <w:b/>
+                <w:color w:val="FFFFFF"/>
+                <w:sz w:val="18"/>
+              </w:rPr>
+              <w:t>Paquete</w:t>
+            </w:r>
+          </w:p>
+        </w:tc>
+        <w:tc>
+          <w:tcPr>
+            <w:tcW w:type="dxa" w:w="1300"/>
+            <w:vAlign w:val="center"/>
+            <w:tcMar>
+              <w:top w:w="100" w:type="dxa"/>
+              <w:left w:w="100" w:type="dxa"/>
+              <w:bottom w:w="100" w:type="dxa"/>
+              <w:right w:w="100" w:type="dxa"/>
+            </w:tcMar>
+            <w:shd w:fill="16365C"/>
+            <w:tcBorders>
+              <w:top w:val="single" w:sz="4" w:color="D9D9D9"/>
+              <w:left w:val="single" w:sz="4" w:color="D9D9D9"/>
+              <w:bottom w:val="single" w:sz="4" w:color="D9D9D9"/>
+              <w:right w:val="single" w:sz="4" w:color="D9D9D9"/>
+            </w:tcBorders>
+          </w:tcPr>
+          <w:p>
+            <w:pPr>
+              <w:spacing w:after="40" w:line="252" w:lineRule="auto"/>
+              <w:jc w:val="center"/>
+            </w:pPr>
+            <w:r>
+              <w:rPr>
+                <w:rFonts w:ascii="Calibri" w:hAnsi="Calibri"/>
+                <w:b/>
+                <w:color w:val="FFFFFF"/>
+                <w:sz w:val="18"/>
+              </w:rPr>
+              <w:t>Declarada</w:t>
+            </w:r>
+          </w:p>
+        </w:tc>
+        <w:tc>
+          <w:tcPr>
+            <w:tcW w:type="dxa" w:w="1300"/>
+            <w:vAlign w:val="center"/>
+            <w:tcMar>
+              <w:top w:w="100" w:type="dxa"/>
+              <w:left w:w="100" w:type="dxa"/>
+              <w:bottom w:w="100" w:type="dxa"/>
+              <w:right w:w="100" w:type="dxa"/>
+            </w:tcMar>
+            <w:shd w:fill="16365C"/>
+            <w:tcBorders>
+              <w:top w:val="single" w:sz="4" w:color="D9D9D9"/>
+              <w:left w:val="single" w:sz="4" w:color="D9D9D9"/>
+              <w:bottom w:val="single" w:sz="4" w:color="D9D9D9"/>
+              <w:right w:val="single" w:sz="4" w:color="D9D9D9"/>
+            </w:tcBorders>
+          </w:tcPr>
+          <w:p>
+            <w:pPr>
+              <w:spacing w:after="40" w:line="252" w:lineRule="auto"/>
+              <w:jc w:val="center"/>
+            </w:pPr>
+            <w:r>
+              <w:rPr>
+                <w:rFonts w:ascii="Calibri" w:hAnsi="Calibri"/>
+                <w:b/>
+                <w:color w:val="FFFFFF"/>
+                <w:sz w:val="18"/>
+              </w:rPr>
+              <w:t>Fijada</w:t>
+            </w:r>
+          </w:p>
+        </w:tc>
+        <w:tc>
+          <w:tcPr>
+            <w:tcW w:type="dxa" w:w="5500"/>
+            <w:vAlign w:val="center"/>
+            <w:tcMar>
+              <w:top w:w="100" w:type="dxa"/>
+              <w:left w:w="100" w:type="dxa"/>
+              <w:bottom w:w="100" w:type="dxa"/>
+              <w:right w:w="100" w:type="dxa"/>
+            </w:tcMar>
+            <w:shd w:fill="16365C"/>
+            <w:tcBorders>
+              <w:top w:val="single" w:sz="4" w:color="D9D9D9"/>
+              <w:left w:val="single" w:sz="4" w:color="D9D9D9"/>
+              <w:bottom w:val="single" w:sz="4" w:color="D9D9D9"/>
+              <w:right w:val="single" w:sz="4" w:color="D9D9D9"/>
+            </w:tcBorders>
+          </w:tcPr>
+          <w:p>
+            <w:pPr>
+              <w:spacing w:after="40" w:line="252" w:lineRule="auto"/>
+            </w:pPr>
+            <w:r>
+              <w:rPr>
+                <w:rFonts w:ascii="Calibri" w:hAnsi="Calibri"/>
+                <w:b/>
+                <w:color w:val="FFFFFF"/>
+                <w:sz w:val="18"/>
+              </w:rPr>
+              <w:t>Uso en Biblioteca Tec</w:t>
+            </w:r>
+          </w:p>
+        </w:tc>
+      </w:tr>
+      <w:tr>
+        <w:trPr>
+          <w:cantSplit/>
+        </w:trPr>
+        <w:tc>
+          <w:tcPr>
+            <w:tcW w:type="dxa" w:w="2200"/>
+            <w:vAlign w:val="center"/>
+            <w:tcMar>
+              <w:top w:w="100" w:type="dxa"/>
+              <w:left w:w="100" w:type="dxa"/>
+              <w:bottom w:w="100" w:type="dxa"/>
+              <w:right w:w="100" w:type="dxa"/>
+            </w:tcMar>
+            <w:shd w:fill="FFFFFF"/>
+            <w:tcBorders>
+              <w:top w:val="single" w:sz="4" w:color="D9D9D9"/>
+              <w:left w:val="single" w:sz="4" w:color="D9D9D9"/>
+              <w:bottom w:val="single" w:sz="4" w:color="D9D9D9"/>
+              <w:right w:val="single" w:sz="4" w:color="D9D9D9"/>
+            </w:tcBorders>
+          </w:tcPr>
+          <w:p>
+            <w:pPr>
+              <w:spacing w:after="40" w:line="252" w:lineRule="auto"/>
+            </w:pPr>
+            <w:r>
+              <w:rPr>
+                <w:rFonts w:ascii="Calibri" w:hAnsi="Calibri"/>
+                <w:b w:val="0"/>
+                <w:color w:val="000000"/>
+                <w:sz w:val="18"/>
+              </w:rPr>
+              <w:t>express</w:t>
+            </w:r>
+          </w:p>
+        </w:tc>
+        <w:tc>
+          <w:tcPr>
+            <w:tcW w:type="dxa" w:w="1300"/>
+            <w:vAlign w:val="center"/>
+            <w:tcMar>
+              <w:top w:w="100" w:type="dxa"/>
+              <w:left w:w="100" w:type="dxa"/>
+              <w:bottom w:w="100" w:type="dxa"/>
+              <w:right w:w="100" w:type="dxa"/>
+            </w:tcMar>
+            <w:shd w:fill="FFFFFF"/>
+            <w:tcBorders>
+              <w:top w:val="single" w:sz="4" w:color="D9D9D9"/>
+              <w:left w:val="single" w:sz="4" w:color="D9D9D9"/>
+              <w:bottom w:val="single" w:sz="4" w:color="D9D9D9"/>
+              <w:right w:val="single" w:sz="4" w:color="D9D9D9"/>
+            </w:tcBorders>
+          </w:tcPr>
+          <w:p>
+            <w:pPr>
+              <w:spacing w:after="40" w:line="252" w:lineRule="auto"/>
+              <w:jc w:val="center"/>
+            </w:pPr>
+            <w:r>
+              <w:rPr>
+                <w:rFonts w:ascii="Calibri" w:hAnsi="Calibri"/>
+                <w:b w:val="0"/>
+                <w:color w:val="000000"/>
+                <w:sz w:val="18"/>
+              </w:rPr>
+              <w:t>^4.22.2</w:t>
+            </w:r>
+          </w:p>
+        </w:tc>
+        <w:tc>
+          <w:tcPr>
+            <w:tcW w:type="dxa" w:w="1300"/>
+            <w:vAlign w:val="center"/>
+            <w:tcMar>
+              <w:top w:w="100" w:type="dxa"/>
+              <w:left w:w="100" w:type="dxa"/>
+              <w:bottom w:w="100" w:type="dxa"/>
+              <w:right w:w="100" w:type="dxa"/>
+            </w:tcMar>
+            <w:shd w:fill="FFFFFF"/>
+            <w:tcBorders>
+              <w:top w:val="single" w:sz="4" w:color="D9D9D9"/>
+              <w:left w:val="single" w:sz="4" w:color="D9D9D9"/>
+              <w:bottom w:val="single" w:sz="4" w:color="D9D9D9"/>
+              <w:right w:val="single" w:sz="4" w:color="D9D9D9"/>
+            </w:tcBorders>
+          </w:tcPr>
+          <w:p>
+            <w:pPr>
+              <w:spacing w:after="40" w:line="252" w:lineRule="auto"/>
+              <w:jc w:val="center"/>
+            </w:pPr>
+            <w:r>
+              <w:rPr>
+                <w:rFonts w:ascii="Calibri" w:hAnsi="Calibri"/>
+                <w:b w:val="0"/>
+                <w:color w:val="000000"/>
+                <w:sz w:val="18"/>
+              </w:rPr>
+              <w:t>4.22.3</w:t>
+            </w:r>
+          </w:p>
+        </w:tc>
+        <w:tc>
+          <w:tcPr>
+            <w:tcW w:type="dxa" w:w="5500"/>
+            <w:vAlign w:val="center"/>
+            <w:tcMar>
+              <w:top w:w="100" w:type="dxa"/>
+              <w:left w:w="100" w:type="dxa"/>
+              <w:bottom w:w="100" w:type="dxa"/>
+              <w:right w:w="100" w:type="dxa"/>
+            </w:tcMar>
+            <w:shd w:fill="FFFFFF"/>
+            <w:tcBorders>
+              <w:top w:val="single" w:sz="4" w:color="D9D9D9"/>
+              <w:left w:val="single" w:sz="4" w:color="D9D9D9"/>
+              <w:bottom w:val="single" w:sz="4" w:color="D9D9D9"/>
+              <w:right w:val="single" w:sz="4" w:color="D9D9D9"/>
+            </w:tcBorders>
+          </w:tcPr>
+          <w:p>
+            <w:pPr>
+              <w:spacing w:after="40" w:line="252" w:lineRule="auto"/>
+            </w:pPr>
+            <w:r>
+              <w:rPr>
+                <w:rFonts w:ascii="Calibri" w:hAnsi="Calibri"/>
+                <w:b w:val="0"/>
+                <w:color w:val="000000"/>
+                <w:sz w:val="18"/>
+              </w:rPr>
+              <w:t>Servidor HTTP y rutas REST en server.js y routes.</w:t>
+            </w:r>
+          </w:p>
+        </w:tc>
+      </w:tr>
+      <w:tr>
+        <w:trPr>
+          <w:cantSplit/>
+        </w:trPr>
+        <w:tc>
+          <w:tcPr>
+            <w:tcW w:type="dxa" w:w="2200"/>
+            <w:vAlign w:val="center"/>
+            <w:tcMar>
+              <w:top w:w="100" w:type="dxa"/>
+              <w:left w:w="100" w:type="dxa"/>
+              <w:bottom w:w="100" w:type="dxa"/>
+              <w:right w:w="100" w:type="dxa"/>
+            </w:tcMar>
+            <w:shd w:fill="F2F5F8"/>
+            <w:tcBorders>
+              <w:top w:val="single" w:sz="4" w:color="D9D9D9"/>
+              <w:left w:val="single" w:sz="4" w:color="D9D9D9"/>
+              <w:bottom w:val="single" w:sz="4" w:color="D9D9D9"/>
+              <w:right w:val="single" w:sz="4" w:color="D9D9D9"/>
+            </w:tcBorders>
+          </w:tcPr>
+          <w:p>
+            <w:pPr>
+              <w:spacing w:after="40" w:line="252" w:lineRule="auto"/>
+            </w:pPr>
+            <w:r>
+              <w:rPr>
+                <w:rFonts w:ascii="Calibri" w:hAnsi="Calibri"/>
+                <w:b w:val="0"/>
+                <w:color w:val="000000"/>
+                <w:sz w:val="18"/>
+              </w:rPr>
+              <w:t>pg</w:t>
+            </w:r>
+          </w:p>
+        </w:tc>
+        <w:tc>
+          <w:tcPr>
+            <w:tcW w:type="dxa" w:w="1300"/>
+            <w:vAlign w:val="center"/>
+            <w:tcMar>
+              <w:top w:w="100" w:type="dxa"/>
+              <w:left w:w="100" w:type="dxa"/>
+              <w:bottom w:w="100" w:type="dxa"/>
+              <w:right w:w="100" w:type="dxa"/>
+            </w:tcMar>
+            <w:shd w:fill="F2F5F8"/>
+            <w:tcBorders>
+              <w:top w:val="single" w:sz="4" w:color="D9D9D9"/>
+              <w:left w:val="single" w:sz="4" w:color="D9D9D9"/>
+              <w:bottom w:val="single" w:sz="4" w:color="D9D9D9"/>
+              <w:right w:val="single" w:sz="4" w:color="D9D9D9"/>
+            </w:tcBorders>
+          </w:tcPr>
+          <w:p>
+            <w:pPr>
+              <w:spacing w:after="40" w:line="252" w:lineRule="auto"/>
+              <w:jc w:val="center"/>
+            </w:pPr>
+            <w:r>
+              <w:rPr>
+                <w:rFonts w:ascii="Calibri" w:hAnsi="Calibri"/>
+                <w:b w:val="0"/>
+                <w:color w:val="000000"/>
+                <w:sz w:val="18"/>
+              </w:rPr>
+              <w:t>^8.22.0</w:t>
+            </w:r>
+          </w:p>
+        </w:tc>
+        <w:tc>
+          <w:tcPr>
+            <w:tcW w:type="dxa" w:w="1300"/>
+            <w:vAlign w:val="center"/>
+            <w:tcMar>
+              <w:top w:w="100" w:type="dxa"/>
+              <w:left w:w="100" w:type="dxa"/>
+              <w:bottom w:w="100" w:type="dxa"/>
+              <w:right w:w="100" w:type="dxa"/>
+            </w:tcMar>
+            <w:shd w:fill="F2F5F8"/>
+            <w:tcBorders>
+              <w:top w:val="single" w:sz="4" w:color="D9D9D9"/>
+              <w:left w:val="single" w:sz="4" w:color="D9D9D9"/>
+              <w:bottom w:val="single" w:sz="4" w:color="D9D9D9"/>
+              <w:right w:val="single" w:sz="4" w:color="D9D9D9"/>
+            </w:tcBorders>
+          </w:tcPr>
+          <w:p>
+            <w:pPr>
+              <w:spacing w:after="40" w:line="252" w:lineRule="auto"/>
+              <w:jc w:val="center"/>
+            </w:pPr>
+            <w:r>
+              <w:rPr>
+                <w:rFonts w:ascii="Calibri" w:hAnsi="Calibri"/>
+                <w:b w:val="0"/>
+                <w:color w:val="000000"/>
+                <w:sz w:val="18"/>
+              </w:rPr>
+              <w:t>8.23.0</w:t>
+            </w:r>
+          </w:p>
+        </w:tc>
+        <w:tc>
+          <w:tcPr>
+            <w:tcW w:type="dxa" w:w="5500"/>
+            <w:vAlign w:val="center"/>
+            <w:tcMar>
+              <w:top w:w="100" w:type="dxa"/>
+              <w:left w:w="100" w:type="dxa"/>
+              <w:bottom w:w="100" w:type="dxa"/>
+              <w:right w:w="100" w:type="dxa"/>
+            </w:tcMar>
+            <w:shd w:fill="F2F5F8"/>
+            <w:tcBorders>
+              <w:top w:val="single" w:sz="4" w:color="D9D9D9"/>
+              <w:left w:val="single" w:sz="4" w:color="D9D9D9"/>
+              <w:bottom w:val="single" w:sz="4" w:color="D9D9D9"/>
+              <w:right w:val="single" w:sz="4" w:color="D9D9D9"/>
+            </w:tcBorders>
+          </w:tcPr>
+          <w:p>
+            <w:pPr>
+              <w:spacing w:after="40" w:line="252" w:lineRule="auto"/>
+            </w:pPr>
+            <w:r>
+              <w:rPr>
+                <w:rFonts w:ascii="Calibri" w:hAnsi="Calibri"/>
+                <w:b w:val="0"/>
+                <w:color w:val="000000"/>
+                <w:sz w:val="18"/>
+              </w:rPr>
+              <w:t>Conexión con PostgreSQL, consultas parametrizadas y transacciones en config/db.js y models.</w:t>
+            </w:r>
+          </w:p>
+        </w:tc>
+      </w:tr>
+      <w:tr>
+        <w:trPr>
+          <w:cantSplit/>
+        </w:trPr>
+        <w:tc>
+          <w:tcPr>
+            <w:tcW w:type="dxa" w:w="2200"/>
+            <w:vAlign w:val="center"/>
+            <w:tcMar>
+              <w:top w:w="100" w:type="dxa"/>
+              <w:left w:w="100" w:type="dxa"/>
+              <w:bottom w:w="100" w:type="dxa"/>
+              <w:right w:w="100" w:type="dxa"/>
+            </w:tcMar>
+            <w:shd w:fill="FFFFFF"/>
+            <w:tcBorders>
+              <w:top w:val="single" w:sz="4" w:color="D9D9D9"/>
+              <w:left w:val="single" w:sz="4" w:color="D9D9D9"/>
+              <w:bottom w:val="single" w:sz="4" w:color="D9D9D9"/>
+              <w:right w:val="single" w:sz="4" w:color="D9D9D9"/>
+            </w:tcBorders>
+          </w:tcPr>
+          <w:p>
+            <w:pPr>
+              <w:spacing w:after="40" w:line="252" w:lineRule="auto"/>
+            </w:pPr>
+            <w:r>
+              <w:rPr>
+                <w:rFonts w:ascii="Calibri" w:hAnsi="Calibri"/>
+                <w:b w:val="0"/>
+                <w:color w:val="000000"/>
+                <w:sz w:val="18"/>
+              </w:rPr>
+              <w:t>dotenv</w:t>
+            </w:r>
+          </w:p>
+        </w:tc>
+        <w:tc>
+          <w:tcPr>
+            <w:tcW w:type="dxa" w:w="1300"/>
+            <w:vAlign w:val="center"/>
+            <w:tcMar>
+              <w:top w:w="100" w:type="dxa"/>
+              <w:left w:w="100" w:type="dxa"/>
+              <w:bottom w:w="100" w:type="dxa"/>
+              <w:right w:w="100" w:type="dxa"/>
+            </w:tcMar>
+            <w:shd w:fill="FFFFFF"/>
+            <w:tcBorders>
+              <w:top w:val="single" w:sz="4" w:color="D9D9D9"/>
+              <w:left w:val="single" w:sz="4" w:color="D9D9D9"/>
+              <w:bottom w:val="single" w:sz="4" w:color="D9D9D9"/>
+              <w:right w:val="single" w:sz="4" w:color="D9D9D9"/>
+            </w:tcBorders>
+          </w:tcPr>
+          <w:p>
+            <w:pPr>
+              <w:spacing w:after="40" w:line="252" w:lineRule="auto"/>
+              <w:jc w:val="center"/>
+            </w:pPr>
+            <w:r>
+              <w:rPr>
+                <w:rFonts w:ascii="Calibri" w:hAnsi="Calibri"/>
+                <w:b w:val="0"/>
+                <w:color w:val="000000"/>
+                <w:sz w:val="18"/>
+              </w:rPr>
+              <w:t>^17.4.2</w:t>
+            </w:r>
+          </w:p>
+        </w:tc>
+        <w:tc>
+          <w:tcPr>
+            <w:tcW w:type="dxa" w:w="1300"/>
+            <w:vAlign w:val="center"/>
+            <w:tcMar>
+              <w:top w:w="100" w:type="dxa"/>
+              <w:left w:w="100" w:type="dxa"/>
+              <w:bottom w:w="100" w:type="dxa"/>
+              <w:right w:w="100" w:type="dxa"/>
+            </w:tcMar>
+            <w:shd w:fill="FFFFFF"/>
+            <w:tcBorders>
+              <w:top w:val="single" w:sz="4" w:color="D9D9D9"/>
+              <w:left w:val="single" w:sz="4" w:color="D9D9D9"/>
+              <w:bottom w:val="single" w:sz="4" w:color="D9D9D9"/>
+              <w:right w:val="single" w:sz="4" w:color="D9D9D9"/>
+            </w:tcBorders>
+          </w:tcPr>
+          <w:p>
+            <w:pPr>
+              <w:spacing w:after="40" w:line="252" w:lineRule="auto"/>
+              <w:jc w:val="center"/>
+            </w:pPr>
+            <w:r>
+              <w:rPr>
+                <w:rFonts w:ascii="Calibri" w:hAnsi="Calibri"/>
+                <w:b w:val="0"/>
+                <w:color w:val="000000"/>
+                <w:sz w:val="18"/>
+              </w:rPr>
+              <w:t>17.4.2</w:t>
+            </w:r>
+          </w:p>
+        </w:tc>
+        <w:tc>
+          <w:tcPr>
+            <w:tcW w:type="dxa" w:w="5500"/>
+            <w:vAlign w:val="center"/>
+            <w:tcMar>
+              <w:top w:w="100" w:type="dxa"/>
+              <w:left w:w="100" w:type="dxa"/>
+              <w:bottom w:w="100" w:type="dxa"/>
+              <w:right w:w="100" w:type="dxa"/>
+            </w:tcMar>
+            <w:shd w:fill="FFFFFF"/>
+            <w:tcBorders>
+              <w:top w:val="single" w:sz="4" w:color="D9D9D9"/>
+              <w:left w:val="single" w:sz="4" w:color="D9D9D9"/>
+              <w:bottom w:val="single" w:sz="4" w:color="D9D9D9"/>
+              <w:right w:val="single" w:sz="4" w:color="D9D9D9"/>
+            </w:tcBorders>
+          </w:tcPr>
+          <w:p>
+            <w:pPr>
+              <w:spacing w:after="40" w:line="252" w:lineRule="auto"/>
+            </w:pPr>
+            <w:r>
+              <w:rPr>
+                <w:rFonts w:ascii="Calibri" w:hAnsi="Calibri"/>
+                <w:b w:val="0"/>
+                <w:color w:val="000000"/>
+                <w:sz w:val="18"/>
+              </w:rPr>
+              <w:t>Carga de variables desde .env para ejecución local; Render las proporciona mediante su entorno.</w:t>
+            </w:r>
+          </w:p>
+        </w:tc>
+      </w:tr>
+      <w:tr>
+        <w:trPr>
+          <w:cantSplit/>
+        </w:trPr>
+        <w:tc>
+          <w:tcPr>
+            <w:tcW w:type="dxa" w:w="2200"/>
+            <w:vAlign w:val="center"/>
+            <w:tcMar>
+              <w:top w:w="100" w:type="dxa"/>
+              <w:left w:w="100" w:type="dxa"/>
+              <w:bottom w:w="100" w:type="dxa"/>
+              <w:right w:w="100" w:type="dxa"/>
+            </w:tcMar>
+            <w:shd w:fill="F2F5F8"/>
+            <w:tcBorders>
+              <w:top w:val="single" w:sz="4" w:color="D9D9D9"/>
+              <w:left w:val="single" w:sz="4" w:color="D9D9D9"/>
+              <w:bottom w:val="single" w:sz="4" w:color="D9D9D9"/>
+              <w:right w:val="single" w:sz="4" w:color="D9D9D9"/>
+            </w:tcBorders>
+          </w:tcPr>
+          <w:p>
+            <w:pPr>
+              <w:spacing w:after="40" w:line="252" w:lineRule="auto"/>
+            </w:pPr>
+            <w:r>
+              <w:rPr>
+                <w:rFonts w:ascii="Calibri" w:hAnsi="Calibri"/>
+                <w:b w:val="0"/>
+                <w:color w:val="000000"/>
+                <w:sz w:val="18"/>
+              </w:rPr>
+              <w:t>cors</w:t>
+            </w:r>
+          </w:p>
+        </w:tc>
+        <w:tc>
+          <w:tcPr>
+            <w:tcW w:type="dxa" w:w="1300"/>
+            <w:vAlign w:val="center"/>
+            <w:tcMar>
+              <w:top w:w="100" w:type="dxa"/>
+              <w:left w:w="100" w:type="dxa"/>
+              <w:bottom w:w="100" w:type="dxa"/>
+              <w:right w:w="100" w:type="dxa"/>
+            </w:tcMar>
+            <w:shd w:fill="F2F5F8"/>
+            <w:tcBorders>
+              <w:top w:val="single" w:sz="4" w:color="D9D9D9"/>
+              <w:left w:val="single" w:sz="4" w:color="D9D9D9"/>
+              <w:bottom w:val="single" w:sz="4" w:color="D9D9D9"/>
+              <w:right w:val="single" w:sz="4" w:color="D9D9D9"/>
+            </w:tcBorders>
+          </w:tcPr>
+          <w:p>
+            <w:pPr>
+              <w:spacing w:after="40" w:line="252" w:lineRule="auto"/>
+              <w:jc w:val="center"/>
+            </w:pPr>
+            <w:r>
+              <w:rPr>
+                <w:rFonts w:ascii="Calibri" w:hAnsi="Calibri"/>
+                <w:b w:val="0"/>
+                <w:color w:val="000000"/>
+                <w:sz w:val="18"/>
+              </w:rPr>
+              <w:t>^2.8.6</w:t>
+            </w:r>
+          </w:p>
+        </w:tc>
+        <w:tc>
+          <w:tcPr>
+            <w:tcW w:type="dxa" w:w="1300"/>
+            <w:vAlign w:val="center"/>
+            <w:tcMar>
+              <w:top w:w="100" w:type="dxa"/>
+              <w:left w:w="100" w:type="dxa"/>
+              <w:bottom w:w="100" w:type="dxa"/>
+              <w:right w:w="100" w:type="dxa"/>
+            </w:tcMar>
+            <w:shd w:fill="F2F5F8"/>
+            <w:tcBorders>
+              <w:top w:val="single" w:sz="4" w:color="D9D9D9"/>
+              <w:left w:val="single" w:sz="4" w:color="D9D9D9"/>
+              <w:bottom w:val="single" w:sz="4" w:color="D9D9D9"/>
+              <w:right w:val="single" w:sz="4" w:color="D9D9D9"/>
+            </w:tcBorders>
+          </w:tcPr>
+          <w:p>
+            <w:pPr>
+              <w:spacing w:after="40" w:line="252" w:lineRule="auto"/>
+              <w:jc w:val="center"/>
+            </w:pPr>
+            <w:r>
+              <w:rPr>
+                <w:rFonts w:ascii="Calibri" w:hAnsi="Calibri"/>
+                <w:b w:val="0"/>
+                <w:color w:val="000000"/>
+                <w:sz w:val="18"/>
+              </w:rPr>
+              <w:t>2.8.6</w:t>
+            </w:r>
+          </w:p>
+        </w:tc>
+        <w:tc>
+          <w:tcPr>
+            <w:tcW w:type="dxa" w:w="5500"/>
+            <w:vAlign w:val="center"/>
+            <w:tcMar>
+              <w:top w:w="100" w:type="dxa"/>
+              <w:left w:w="100" w:type="dxa"/>
+              <w:bottom w:w="100" w:type="dxa"/>
+              <w:right w:w="100" w:type="dxa"/>
+            </w:tcMar>
+            <w:shd w:fill="F2F5F8"/>
+            <w:tcBorders>
+              <w:top w:val="single" w:sz="4" w:color="D9D9D9"/>
+              <w:left w:val="single" w:sz="4" w:color="D9D9D9"/>
+              <w:bottom w:val="single" w:sz="4" w:color="D9D9D9"/>
+              <w:right w:val="single" w:sz="4" w:color="D9D9D9"/>
+            </w:tcBorders>
+          </w:tcPr>
+          <w:p>
+            <w:pPr>
+              <w:spacing w:after="40" w:line="252" w:lineRule="auto"/>
+            </w:pPr>
+            <w:r>
+              <w:rPr>
+                <w:rFonts w:ascii="Calibri" w:hAnsi="Calibri"/>
+                <w:b w:val="0"/>
+                <w:color w:val="000000"/>
+                <w:sz w:val="18"/>
+              </w:rPr>
+              <w:t>Orígenes permitidos mediante FRONTEND_URL; no reemplaza la autenticación.</w:t>
+            </w:r>
+          </w:p>
+        </w:tc>
+      </w:tr>
+      <w:tr>
+        <w:trPr>
+          <w:cantSplit/>
+        </w:trPr>
+        <w:tc>
+          <w:tcPr>
+            <w:tcW w:type="dxa" w:w="2200"/>
+            <w:vAlign w:val="center"/>
+            <w:tcMar>
+              <w:top w:w="100" w:type="dxa"/>
+              <w:left w:w="100" w:type="dxa"/>
+              <w:bottom w:w="100" w:type="dxa"/>
+              <w:right w:w="100" w:type="dxa"/>
+            </w:tcMar>
+            <w:shd w:fill="FFFFFF"/>
+            <w:tcBorders>
+              <w:top w:val="single" w:sz="4" w:color="D9D9D9"/>
+              <w:left w:val="single" w:sz="4" w:color="D9D9D9"/>
+              <w:bottom w:val="single" w:sz="4" w:color="D9D9D9"/>
+              <w:right w:val="single" w:sz="4" w:color="D9D9D9"/>
+            </w:tcBorders>
+          </w:tcPr>
+          <w:p>
+            <w:pPr>
+              <w:spacing w:after="40" w:line="252" w:lineRule="auto"/>
+            </w:pPr>
+            <w:r>
+              <w:rPr>
+                <w:rFonts w:ascii="Calibri" w:hAnsi="Calibri"/>
+                <w:b w:val="0"/>
+                <w:color w:val="000000"/>
+                <w:sz w:val="18"/>
+              </w:rPr>
+              <w:t>helmet</w:t>
+            </w:r>
+          </w:p>
+        </w:tc>
+        <w:tc>
+          <w:tcPr>
+            <w:tcW w:type="dxa" w:w="1300"/>
+            <w:vAlign w:val="center"/>
+            <w:tcMar>
+              <w:top w:w="100" w:type="dxa"/>
+              <w:left w:w="100" w:type="dxa"/>
+              <w:bottom w:w="100" w:type="dxa"/>
+              <w:right w:w="100" w:type="dxa"/>
+            </w:tcMar>
+            <w:shd w:fill="FFFFFF"/>
+            <w:tcBorders>
+              <w:top w:val="single" w:sz="4" w:color="D9D9D9"/>
+              <w:left w:val="single" w:sz="4" w:color="D9D9D9"/>
+              <w:bottom w:val="single" w:sz="4" w:color="D9D9D9"/>
+              <w:right w:val="single" w:sz="4" w:color="D9D9D9"/>
+            </w:tcBorders>
+          </w:tcPr>
+          <w:p>
+            <w:pPr>
+              <w:spacing w:after="40" w:line="252" w:lineRule="auto"/>
+              <w:jc w:val="center"/>
+            </w:pPr>
+            <w:r>
+              <w:rPr>
+                <w:rFonts w:ascii="Calibri" w:hAnsi="Calibri"/>
+                <w:b w:val="0"/>
+                <w:color w:val="000000"/>
+                <w:sz w:val="18"/>
+              </w:rPr>
+              <w:t>^8.3.0</w:t>
+            </w:r>
+          </w:p>
+        </w:tc>
+        <w:tc>
+          <w:tcPr>
+            <w:tcW w:type="dxa" w:w="1300"/>
+            <w:vAlign w:val="center"/>
+            <w:tcMar>
+              <w:top w:w="100" w:type="dxa"/>
+              <w:left w:w="100" w:type="dxa"/>
+              <w:bottom w:w="100" w:type="dxa"/>
+              <w:right w:w="100" w:type="dxa"/>
+            </w:tcMar>
+            <w:shd w:fill="FFFFFF"/>
+            <w:tcBorders>
+              <w:top w:val="single" w:sz="4" w:color="D9D9D9"/>
+              <w:left w:val="single" w:sz="4" w:color="D9D9D9"/>
+              <w:bottom w:val="single" w:sz="4" w:color="D9D9D9"/>
+              <w:right w:val="single" w:sz="4" w:color="D9D9D9"/>
+            </w:tcBorders>
+          </w:tcPr>
+          <w:p>
+            <w:pPr>
+              <w:spacing w:after="40" w:line="252" w:lineRule="auto"/>
+              <w:jc w:val="center"/>
+            </w:pPr>
+            <w:r>
+              <w:rPr>
+                <w:rFonts w:ascii="Calibri" w:hAnsi="Calibri"/>
+                <w:b w:val="0"/>
+                <w:color w:val="000000"/>
+                <w:sz w:val="18"/>
+              </w:rPr>
+              <w:t>8.3.0</w:t>
+            </w:r>
+          </w:p>
+        </w:tc>
+        <w:tc>
+          <w:tcPr>
+            <w:tcW w:type="dxa" w:w="5500"/>
+            <w:vAlign w:val="center"/>
+            <w:tcMar>
+              <w:top w:w="100" w:type="dxa"/>
+              <w:left w:w="100" w:type="dxa"/>
+              <w:bottom w:w="100" w:type="dxa"/>
+              <w:right w:w="100" w:type="dxa"/>
+            </w:tcMar>
+            <w:shd w:fill="FFFFFF"/>
+            <w:tcBorders>
+              <w:top w:val="single" w:sz="4" w:color="D9D9D9"/>
+              <w:left w:val="single" w:sz="4" w:color="D9D9D9"/>
+              <w:bottom w:val="single" w:sz="4" w:color="D9D9D9"/>
+              <w:right w:val="single" w:sz="4" w:color="D9D9D9"/>
+            </w:tcBorders>
+          </w:tcPr>
+          <w:p>
+            <w:pPr>
+              <w:spacing w:after="40" w:line="252" w:lineRule="auto"/>
+            </w:pPr>
+            <w:r>
+              <w:rPr>
+                <w:rFonts w:ascii="Calibri" w:hAnsi="Calibri"/>
+                <w:b w:val="0"/>
+                <w:color w:val="000000"/>
+                <w:sz w:val="18"/>
+              </w:rPr>
+              <w:t>Encabezados HTTP de protección para las respuestas del servidor.</w:t>
+            </w:r>
+          </w:p>
+        </w:tc>
+      </w:tr>
+      <w:tr>
+        <w:trPr>
+          <w:cantSplit/>
+        </w:trPr>
+        <w:tc>
+          <w:tcPr>
+            <w:tcW w:type="dxa" w:w="2200"/>
+            <w:vAlign w:val="center"/>
+            <w:tcMar>
+              <w:top w:w="100" w:type="dxa"/>
+              <w:left w:w="100" w:type="dxa"/>
+              <w:bottom w:w="100" w:type="dxa"/>
+              <w:right w:w="100" w:type="dxa"/>
+            </w:tcMar>
+            <w:shd w:fill="F2F5F8"/>
+            <w:tcBorders>
+              <w:top w:val="single" w:sz="4" w:color="D9D9D9"/>
+              <w:left w:val="single" w:sz="4" w:color="D9D9D9"/>
+              <w:bottom w:val="single" w:sz="4" w:color="D9D9D9"/>
+              <w:right w:val="single" w:sz="4" w:color="D9D9D9"/>
+            </w:tcBorders>
+          </w:tcPr>
+          <w:p>
+            <w:pPr>
+              <w:spacing w:after="40" w:line="252" w:lineRule="auto"/>
+            </w:pPr>
+            <w:r>
+              <w:rPr>
+                <w:rFonts w:ascii="Calibri" w:hAnsi="Calibri"/>
+                <w:b w:val="0"/>
+                <w:color w:val="000000"/>
+                <w:sz w:val="18"/>
+              </w:rPr>
+              <w:t>bcryptjs</w:t>
+            </w:r>
+          </w:p>
+        </w:tc>
+        <w:tc>
+          <w:tcPr>
+            <w:tcW w:type="dxa" w:w="1300"/>
+            <w:vAlign w:val="center"/>
+            <w:tcMar>
+              <w:top w:w="100" w:type="dxa"/>
+              <w:left w:w="100" w:type="dxa"/>
+              <w:bottom w:w="100" w:type="dxa"/>
+              <w:right w:w="100" w:type="dxa"/>
+            </w:tcMar>
+            <w:shd w:fill="F2F5F8"/>
+            <w:tcBorders>
+              <w:top w:val="single" w:sz="4" w:color="D9D9D9"/>
+              <w:left w:val="single" w:sz="4" w:color="D9D9D9"/>
+              <w:bottom w:val="single" w:sz="4" w:color="D9D9D9"/>
+              <w:right w:val="single" w:sz="4" w:color="D9D9D9"/>
+            </w:tcBorders>
+          </w:tcPr>
+          <w:p>
+            <w:pPr>
+              <w:spacing w:after="40" w:line="252" w:lineRule="auto"/>
+              <w:jc w:val="center"/>
+            </w:pPr>
+            <w:r>
+              <w:rPr>
+                <w:rFonts w:ascii="Calibri" w:hAnsi="Calibri"/>
+                <w:b w:val="0"/>
+                <w:color w:val="000000"/>
+                <w:sz w:val="18"/>
+              </w:rPr>
+              <w:t>^3.0.3</w:t>
+            </w:r>
+          </w:p>
+        </w:tc>
+        <w:tc>
+          <w:tcPr>
+            <w:tcW w:type="dxa" w:w="1300"/>
+            <w:vAlign w:val="center"/>
+            <w:tcMar>
+              <w:top w:w="100" w:type="dxa"/>
+              <w:left w:w="100" w:type="dxa"/>
+              <w:bottom w:w="100" w:type="dxa"/>
+              <w:right w:w="100" w:type="dxa"/>
+            </w:tcMar>
+            <w:shd w:fill="F2F5F8"/>
+            <w:tcBorders>
+              <w:top w:val="single" w:sz="4" w:color="D9D9D9"/>
+              <w:left w:val="single" w:sz="4" w:color="D9D9D9"/>
+              <w:bottom w:val="single" w:sz="4" w:color="D9D9D9"/>
+              <w:right w:val="single" w:sz="4" w:color="D9D9D9"/>
+            </w:tcBorders>
+          </w:tcPr>
+          <w:p>
+            <w:pPr>
+              <w:spacing w:after="40" w:line="252" w:lineRule="auto"/>
+              <w:jc w:val="center"/>
+            </w:pPr>
+            <w:r>
+              <w:rPr>
+                <w:rFonts w:ascii="Calibri" w:hAnsi="Calibri"/>
+                <w:b w:val="0"/>
+                <w:color w:val="000000"/>
+                <w:sz w:val="18"/>
+              </w:rPr>
+              <w:t>3.0.3</w:t>
+            </w:r>
+          </w:p>
+        </w:tc>
+        <w:tc>
+          <w:tcPr>
+            <w:tcW w:type="dxa" w:w="5500"/>
+            <w:vAlign w:val="center"/>
+            <w:tcMar>
+              <w:top w:w="100" w:type="dxa"/>
+              <w:left w:w="100" w:type="dxa"/>
+              <w:bottom w:w="100" w:type="dxa"/>
+              <w:right w:w="100" w:type="dxa"/>
+            </w:tcMar>
+            <w:shd w:fill="F2F5F8"/>
+            <w:tcBorders>
+              <w:top w:val="single" w:sz="4" w:color="D9D9D9"/>
+              <w:left w:val="single" w:sz="4" w:color="D9D9D9"/>
+              <w:bottom w:val="single" w:sz="4" w:color="D9D9D9"/>
+              <w:right w:val="single" w:sz="4" w:color="D9D9D9"/>
+            </w:tcBorders>
+          </w:tcPr>
+          <w:p>
+            <w:pPr>
+              <w:spacing w:after="40" w:line="252" w:lineRule="auto"/>
+            </w:pPr>
+            <w:r>
+              <w:rPr>
+                <w:rFonts w:ascii="Calibri" w:hAnsi="Calibri"/>
+                <w:b w:val="0"/>
+                <w:color w:val="000000"/>
+                <w:sz w:val="18"/>
+              </w:rPr>
+              <w:t>Comparación de contraseñas con hashes bcrypt y generación de hashes en utilidades.</w:t>
+            </w:r>
+          </w:p>
+        </w:tc>
+      </w:tr>
+      <w:tr>
+        <w:trPr>
+          <w:cantSplit/>
+        </w:trPr>
+        <w:tc>
+          <w:tcPr>
+            <w:tcW w:type="dxa" w:w="2200"/>
+            <w:vAlign w:val="center"/>
+            <w:tcMar>
+              <w:top w:w="100" w:type="dxa"/>
+              <w:left w:w="100" w:type="dxa"/>
+              <w:bottom w:w="100" w:type="dxa"/>
+              <w:right w:w="100" w:type="dxa"/>
+            </w:tcMar>
+            <w:shd w:fill="FFFFFF"/>
+            <w:tcBorders>
+              <w:top w:val="single" w:sz="4" w:color="D9D9D9"/>
+              <w:left w:val="single" w:sz="4" w:color="D9D9D9"/>
+              <w:bottom w:val="single" w:sz="4" w:color="D9D9D9"/>
+              <w:right w:val="single" w:sz="4" w:color="D9D9D9"/>
+            </w:tcBorders>
+          </w:tcPr>
+          <w:p>
+            <w:pPr>
+              <w:spacing w:after="40" w:line="252" w:lineRule="auto"/>
+            </w:pPr>
+            <w:r>
+              <w:rPr>
+                <w:rFonts w:ascii="Calibri" w:hAnsi="Calibri"/>
+                <w:b w:val="0"/>
+                <w:color w:val="000000"/>
+                <w:sz w:val="18"/>
+              </w:rPr>
+              <w:t>jsonwebtoken</w:t>
+            </w:r>
+          </w:p>
+        </w:tc>
+        <w:tc>
+          <w:tcPr>
+            <w:tcW w:type="dxa" w:w="1300"/>
+            <w:vAlign w:val="center"/>
+            <w:tcMar>
+              <w:top w:w="100" w:type="dxa"/>
+              <w:left w:w="100" w:type="dxa"/>
+              <w:bottom w:w="100" w:type="dxa"/>
+              <w:right w:w="100" w:type="dxa"/>
+            </w:tcMar>
+            <w:shd w:fill="FFFFFF"/>
+            <w:tcBorders>
+              <w:top w:val="single" w:sz="4" w:color="D9D9D9"/>
+              <w:left w:val="single" w:sz="4" w:color="D9D9D9"/>
+              <w:bottom w:val="single" w:sz="4" w:color="D9D9D9"/>
+              <w:right w:val="single" w:sz="4" w:color="D9D9D9"/>
+            </w:tcBorders>
+          </w:tcPr>
+          <w:p>
+            <w:pPr>
+              <w:spacing w:after="40" w:line="252" w:lineRule="auto"/>
+              <w:jc w:val="center"/>
+            </w:pPr>
+            <w:r>
+              <w:rPr>
+                <w:rFonts w:ascii="Calibri" w:hAnsi="Calibri"/>
+                <w:b w:val="0"/>
+                <w:color w:val="000000"/>
+                <w:sz w:val="18"/>
+              </w:rPr>
+              <w:t>^9.0.3</w:t>
+            </w:r>
+          </w:p>
+        </w:tc>
+        <w:tc>
+          <w:tcPr>
+            <w:tcW w:type="dxa" w:w="1300"/>
+            <w:vAlign w:val="center"/>
+            <w:tcMar>
+              <w:top w:w="100" w:type="dxa"/>
+              <w:left w:w="100" w:type="dxa"/>
+              <w:bottom w:w="100" w:type="dxa"/>
+              <w:right w:w="100" w:type="dxa"/>
+            </w:tcMar>
+            <w:shd w:fill="FFFFFF"/>
+            <w:tcBorders>
+              <w:top w:val="single" w:sz="4" w:color="D9D9D9"/>
+              <w:left w:val="single" w:sz="4" w:color="D9D9D9"/>
+              <w:bottom w:val="single" w:sz="4" w:color="D9D9D9"/>
+              <w:right w:val="single" w:sz="4" w:color="D9D9D9"/>
+            </w:tcBorders>
+          </w:tcPr>
+          <w:p>
+            <w:pPr>
+              <w:spacing w:after="40" w:line="252" w:lineRule="auto"/>
+              <w:jc w:val="center"/>
+            </w:pPr>
+            <w:r>
+              <w:rPr>
+                <w:rFonts w:ascii="Calibri" w:hAnsi="Calibri"/>
+                <w:b w:val="0"/>
+                <w:color w:val="000000"/>
+                <w:sz w:val="18"/>
+              </w:rPr>
+              <w:t>9.0.3</w:t>
+            </w:r>
+          </w:p>
+        </w:tc>
+        <w:tc>
+          <w:tcPr>
+            <w:tcW w:type="dxa" w:w="5500"/>
+            <w:vAlign w:val="center"/>
+            <w:tcMar>
+              <w:top w:w="100" w:type="dxa"/>
+              <w:left w:w="100" w:type="dxa"/>
+              <w:bottom w:w="100" w:type="dxa"/>
+              <w:right w:w="100" w:type="dxa"/>
+            </w:tcMar>
+            <w:shd w:fill="FFFFFF"/>
+            <w:tcBorders>
+              <w:top w:val="single" w:sz="4" w:color="D9D9D9"/>
+              <w:left w:val="single" w:sz="4" w:color="D9D9D9"/>
+              <w:bottom w:val="single" w:sz="4" w:color="D9D9D9"/>
+              <w:right w:val="single" w:sz="4" w:color="D9D9D9"/>
+            </w:tcBorders>
+          </w:tcPr>
+          <w:p>
+            <w:pPr>
+              <w:spacing w:after="40" w:line="252" w:lineRule="auto"/>
+            </w:pPr>
+            <w:r>
+              <w:rPr>
+                <w:rFonts w:ascii="Calibri" w:hAnsi="Calibri"/>
+                <w:b w:val="0"/>
+                <w:color w:val="000000"/>
+                <w:sz w:val="18"/>
+              </w:rPr>
+              <w:t>Firma y validación de JWT HS256; sesiones de ocho horas.</w:t>
+            </w:r>
+          </w:p>
+        </w:tc>
+      </w:tr>
+      <w:tr>
+        <w:trPr>
+          <w:cantSplit/>
+        </w:trPr>
+        <w:tc>
+          <w:tcPr>
+            <w:tcW w:type="dxa" w:w="2200"/>
+            <w:vAlign w:val="center"/>
+            <w:tcMar>
+              <w:top w:w="100" w:type="dxa"/>
+              <w:left w:w="100" w:type="dxa"/>
+              <w:bottom w:w="100" w:type="dxa"/>
+              <w:right w:w="100" w:type="dxa"/>
+            </w:tcMar>
+            <w:shd w:fill="F2F5F8"/>
+            <w:tcBorders>
+              <w:top w:val="single" w:sz="4" w:color="D9D9D9"/>
+              <w:left w:val="single" w:sz="4" w:color="D9D9D9"/>
+              <w:bottom w:val="single" w:sz="4" w:color="D9D9D9"/>
+              <w:right w:val="single" w:sz="4" w:color="D9D9D9"/>
+            </w:tcBorders>
+          </w:tcPr>
+          <w:p>
+            <w:pPr>
+              <w:spacing w:after="40" w:line="252" w:lineRule="auto"/>
+            </w:pPr>
+            <w:r>
+              <w:rPr>
+                <w:rFonts w:ascii="Calibri" w:hAnsi="Calibri"/>
+                <w:b w:val="0"/>
+                <w:color w:val="000000"/>
+                <w:sz w:val="18"/>
+              </w:rPr>
+              <w:t>express-rate-limit</w:t>
+            </w:r>
+          </w:p>
+        </w:tc>
+        <w:tc>
+          <w:tcPr>
+            <w:tcW w:type="dxa" w:w="1300"/>
+            <w:vAlign w:val="center"/>
+            <w:tcMar>
+              <w:top w:w="100" w:type="dxa"/>
+              <w:left w:w="100" w:type="dxa"/>
+              <w:bottom w:w="100" w:type="dxa"/>
+              <w:right w:w="100" w:type="dxa"/>
+            </w:tcMar>
+            <w:shd w:fill="F2F5F8"/>
+            <w:tcBorders>
+              <w:top w:val="single" w:sz="4" w:color="D9D9D9"/>
+              <w:left w:val="single" w:sz="4" w:color="D9D9D9"/>
+              <w:bottom w:val="single" w:sz="4" w:color="D9D9D9"/>
+              <w:right w:val="single" w:sz="4" w:color="D9D9D9"/>
+            </w:tcBorders>
+          </w:tcPr>
+          <w:p>
+            <w:pPr>
+              <w:spacing w:after="40" w:line="252" w:lineRule="auto"/>
+              <w:jc w:val="center"/>
+            </w:pPr>
+            <w:r>
+              <w:rPr>
+                <w:rFonts w:ascii="Calibri" w:hAnsi="Calibri"/>
+                <w:b w:val="0"/>
+                <w:color w:val="000000"/>
+                <w:sz w:val="18"/>
+              </w:rPr>
+              <w:t>^8.7.1</w:t>
+            </w:r>
+          </w:p>
+        </w:tc>
+        <w:tc>
+          <w:tcPr>
+            <w:tcW w:type="dxa" w:w="1300"/>
+            <w:vAlign w:val="center"/>
+            <w:tcMar>
+              <w:top w:w="100" w:type="dxa"/>
+              <w:left w:w="100" w:type="dxa"/>
+              <w:bottom w:w="100" w:type="dxa"/>
+              <w:right w:w="100" w:type="dxa"/>
+            </w:tcMar>
+            <w:shd w:fill="F2F5F8"/>
+            <w:tcBorders>
+              <w:top w:val="single" w:sz="4" w:color="D9D9D9"/>
+              <w:left w:val="single" w:sz="4" w:color="D9D9D9"/>
+              <w:bottom w:val="single" w:sz="4" w:color="D9D9D9"/>
+              <w:right w:val="single" w:sz="4" w:color="D9D9D9"/>
+            </w:tcBorders>
+          </w:tcPr>
+          <w:p>
+            <w:pPr>
+              <w:spacing w:after="40" w:line="252" w:lineRule="auto"/>
+              <w:jc w:val="center"/>
+            </w:pPr>
+            <w:r>
+              <w:rPr>
+                <w:rFonts w:ascii="Calibri" w:hAnsi="Calibri"/>
+                <w:b w:val="0"/>
+                <w:color w:val="000000"/>
+                <w:sz w:val="18"/>
+              </w:rPr>
+              <w:t>8.7.1</w:t>
+            </w:r>
+          </w:p>
+        </w:tc>
+        <w:tc>
+          <w:tcPr>
+            <w:tcW w:type="dxa" w:w="5500"/>
+            <w:vAlign w:val="center"/>
+            <w:tcMar>
+              <w:top w:w="100" w:type="dxa"/>
+              <w:left w:w="100" w:type="dxa"/>
+              <w:bottom w:w="100" w:type="dxa"/>
+              <w:right w:w="100" w:type="dxa"/>
+            </w:tcMar>
+            <w:shd w:fill="F2F5F8"/>
+            <w:tcBorders>
+              <w:top w:val="single" w:sz="4" w:color="D9D9D9"/>
+              <w:left w:val="single" w:sz="4" w:color="D9D9D9"/>
+              <w:bottom w:val="single" w:sz="4" w:color="D9D9D9"/>
+              <w:right w:val="single" w:sz="4" w:color="D9D9D9"/>
+            </w:tcBorders>
+          </w:tcPr>
+          <w:p>
+            <w:pPr>
+              <w:spacing w:after="40" w:line="252" w:lineRule="auto"/>
+            </w:pPr>
+            <w:r>
+              <w:rPr>
+                <w:rFonts w:ascii="Calibri" w:hAnsi="Calibri"/>
+                <w:b w:val="0"/>
+                <w:color w:val="000000"/>
+                <w:sz w:val="18"/>
+              </w:rPr>
+              <w:t>Límite de 10 solicitudes de login por IP cada 15 minutos; rechazo HTTP 429.</w:t>
+            </w:r>
+          </w:p>
+        </w:tc>
+      </w:tr>
+    </w:tbl>
+    <w:p xmlns:w="http://schemas.openxmlformats.org/wordprocessingml/2006/main" xmlns:wpc="http://schemas.microsoft.com/office/word/2010/wordprocessingCanvas" xmlns:mo="http://schemas.microsoft.com/office/mac/office/2008/main" xmlns:mc="http://schemas.openxmlformats.org/markup-compatibility/2006" xmlns:mv="urn:schemas-microsoft-com:mac:vml" xmlns:o="urn:schemas-microsoft-com:office:office" xmlns:r="http://schemas.openxmlformats.org/officeDocument/2006/relationships" xmlns:m="http://schemas.openxmlformats.org/officeDocument/2006/math" xmlns:v="urn:schemas-microsoft-com:vml" xmlns:wp14="http://schemas.microsoft.com/office/word/2010/wordprocessingDrawing" xmlns:wp="http://schemas.openxmlformats.org/drawingml/2006/wordprocessingDrawing" xmlns:w10="urn:schemas-microsoft-com:office:word" xmlns:w14="http://schemas.microsoft.com/office/word/2010/wordml" xmlns:wpg="http://schemas.microsoft.com/office/word/2010/wordprocessingGroup" xmlns:wpi="http://schemas.microsoft.com/office/word/2010/wordprocessingInk" xmlns:wne="http://schemas.microsoft.com/office/word/2006/wordml" xmlns:wps="http://schemas.microsoft.com/office/word/2010/wordprocessingShape">
+      <w:pPr>
+        <w:keepNext/>
+        <w:spacing w:after="140" w:line="259" w:lineRule="auto" w:before="200"/>
+      </w:pPr>
+      <w:r>
+        <w:rPr>
+          <w:rFonts w:ascii="Calibri" w:hAnsi="Calibri"/>
+          <w:b/>
+          <w:color w:val="000000"/>
+          <w:sz w:val="24"/>
+        </w:rPr>
+        <w:t>5 2 Frontend</w:t>
+      </w:r>
+    </w:p>
+    <w:tbl xmlns:w="http://schemas.openxmlformats.org/wordprocessingml/2006/main" xmlns:wpc="http://schemas.microsoft.com/office/word/2010/wordprocessingCanvas" xmlns:mo="http://schemas.microsoft.com/office/mac/office/2008/main" xmlns:mc="http://schemas.openxmlformats.org/markup-compatibility/2006" xmlns:mv="urn:schemas-microsoft-com:mac:vml" xmlns:o="urn:schemas-microsoft-com:office:office" xmlns:r="http://schemas.openxmlformats.org/officeDocument/2006/relationships" xmlns:m="http://schemas.openxmlformats.org/officeDocument/2006/math" xmlns:v="urn:schemas-microsoft-com:vml" xmlns:wp14="http://schemas.microsoft.com/office/word/2010/wordprocessingDrawing" xmlns:wp="http://schemas.openxmlformats.org/drawingml/2006/wordprocessingDrawing" xmlns:w10="urn:schemas-microsoft-com:office:word" xmlns:w14="http://schemas.microsoft.com/office/word/2010/wordml" xmlns:wpg="http://schemas.microsoft.com/office/word/2010/wordprocessingGroup" xmlns:wpi="http://schemas.microsoft.com/office/word/2010/wordprocessingInk" xmlns:wne="http://schemas.microsoft.com/office/word/2006/wordml" xmlns:wps="http://schemas.microsoft.com/office/word/2010/wordprocessingShape">
+      <w:tblPr>
+        <w:tblW w:type="auto" w:w="0"/>
+        <w:tblLayout w:type="fixed"/>
+        <w:tblLook w:firstColumn="1" w:firstRow="1" w:lastColumn="0" w:lastRow="0" w:noHBand="0" w:noVBand="1" w:val="04A0"/>
+      </w:tblPr>
+      <w:tblGrid>
+        <w:gridCol w:w="2200"/>
+        <w:gridCol w:w="1300"/>
+        <w:gridCol w:w="1300"/>
+        <w:gridCol w:w="5500"/>
+      </w:tblGrid>
+      <w:tr>
+        <w:trPr>
+          <w:tblHeader/>
+          <w:cantSplit/>
+        </w:trPr>
+        <w:tc>
+          <w:tcPr>
+            <w:tcW w:type="dxa" w:w="2200"/>
+            <w:vAlign w:val="center"/>
+            <w:tcMar>
+              <w:top w:w="100" w:type="dxa"/>
+              <w:left w:w="100" w:type="dxa"/>
+              <w:bottom w:w="100" w:type="dxa"/>
+              <w:right w:w="100" w:type="dxa"/>
+            </w:tcMar>
+            <w:shd w:fill="16365C"/>
+            <w:tcBorders>
+              <w:top w:val="single" w:sz="4" w:color="D9D9D9"/>
+              <w:left w:val="single" w:sz="4" w:color="D9D9D9"/>
+              <w:bottom w:val="single" w:sz="4" w:color="D9D9D9"/>
+              <w:right w:val="single" w:sz="4" w:color="D9D9D9"/>
+            </w:tcBorders>
+          </w:tcPr>
+          <w:p>
+            <w:pPr>
+              <w:spacing w:after="40" w:line="252" w:lineRule="auto"/>
+            </w:pPr>
+            <w:r>
+              <w:rPr>
+                <w:rFonts w:ascii="Calibri" w:hAnsi="Calibri"/>
+                <w:b/>
+                <w:color w:val="FFFFFF"/>
+                <w:sz w:val="18"/>
+              </w:rPr>
+              <w:t>Paquete</w:t>
+            </w:r>
+          </w:p>
+        </w:tc>
+        <w:tc>
+          <w:tcPr>
+            <w:tcW w:type="dxa" w:w="1300"/>
+            <w:vAlign w:val="center"/>
+            <w:tcMar>
+              <w:top w:w="100" w:type="dxa"/>
+              <w:left w:w="100" w:type="dxa"/>
+              <w:bottom w:w="100" w:type="dxa"/>
+              <w:right w:w="100" w:type="dxa"/>
+            </w:tcMar>
+            <w:shd w:fill="16365C"/>
+            <w:tcBorders>
+              <w:top w:val="single" w:sz="4" w:color="D9D9D9"/>
+              <w:left w:val="single" w:sz="4" w:color="D9D9D9"/>
+              <w:bottom w:val="single" w:sz="4" w:color="D9D9D9"/>
+              <w:right w:val="single" w:sz="4" w:color="D9D9D9"/>
+            </w:tcBorders>
+          </w:tcPr>
+          <w:p>
+            <w:pPr>
+              <w:spacing w:after="40" w:line="252" w:lineRule="auto"/>
+              <w:jc w:val="center"/>
+            </w:pPr>
+            <w:r>
+              <w:rPr>
+                <w:rFonts w:ascii="Calibri" w:hAnsi="Calibri"/>
+                <w:b/>
+                <w:color w:val="FFFFFF"/>
+                <w:sz w:val="18"/>
+              </w:rPr>
+              <w:t>Declarada</w:t>
+            </w:r>
+          </w:p>
+        </w:tc>
+        <w:tc>
+          <w:tcPr>
+            <w:tcW w:type="dxa" w:w="1300"/>
+            <w:vAlign w:val="center"/>
+            <w:tcMar>
+              <w:top w:w="100" w:type="dxa"/>
+              <w:left w:w="100" w:type="dxa"/>
+              <w:bottom w:w="100" w:type="dxa"/>
+              <w:right w:w="100" w:type="dxa"/>
+            </w:tcMar>
+            <w:shd w:fill="16365C"/>
+            <w:tcBorders>
+              <w:top w:val="single" w:sz="4" w:color="D9D9D9"/>
+              <w:left w:val="single" w:sz="4" w:color="D9D9D9"/>
+              <w:bottom w:val="single" w:sz="4" w:color="D9D9D9"/>
+              <w:right w:val="single" w:sz="4" w:color="D9D9D9"/>
+            </w:tcBorders>
+          </w:tcPr>
+          <w:p>
+            <w:pPr>
+              <w:spacing w:after="40" w:line="252" w:lineRule="auto"/>
+              <w:jc w:val="center"/>
+            </w:pPr>
+            <w:r>
+              <w:rPr>
+                <w:rFonts w:ascii="Calibri" w:hAnsi="Calibri"/>
+                <w:b/>
+                <w:color w:val="FFFFFF"/>
+                <w:sz w:val="18"/>
+              </w:rPr>
+              <w:t>Fijada</w:t>
+            </w:r>
+          </w:p>
+        </w:tc>
+        <w:tc>
+          <w:tcPr>
+            <w:tcW w:type="dxa" w:w="5500"/>
+            <w:vAlign w:val="center"/>
+            <w:tcMar>
+              <w:top w:w="100" w:type="dxa"/>
+              <w:left w:w="100" w:type="dxa"/>
+              <w:bottom w:w="100" w:type="dxa"/>
+              <w:right w:w="100" w:type="dxa"/>
+            </w:tcMar>
+            <w:shd w:fill="16365C"/>
+            <w:tcBorders>
+              <w:top w:val="single" w:sz="4" w:color="D9D9D9"/>
+              <w:left w:val="single" w:sz="4" w:color="D9D9D9"/>
+              <w:bottom w:val="single" w:sz="4" w:color="D9D9D9"/>
+              <w:right w:val="single" w:sz="4" w:color="D9D9D9"/>
+            </w:tcBorders>
+          </w:tcPr>
+          <w:p>
+            <w:pPr>
+              <w:spacing w:after="40" w:line="252" w:lineRule="auto"/>
+            </w:pPr>
+            <w:r>
+              <w:rPr>
+                <w:rFonts w:ascii="Calibri" w:hAnsi="Calibri"/>
+                <w:b/>
+                <w:color w:val="FFFFFF"/>
+                <w:sz w:val="18"/>
+              </w:rPr>
+              <w:t>Uso en Biblioteca Tec</w:t>
+            </w:r>
+          </w:p>
+        </w:tc>
+      </w:tr>
+      <w:tr>
+        <w:trPr>
+          <w:cantSplit/>
+        </w:trPr>
+        <w:tc>
+          <w:tcPr>
+            <w:tcW w:type="dxa" w:w="2200"/>
+            <w:vAlign w:val="center"/>
+            <w:tcMar>
+              <w:top w:w="100" w:type="dxa"/>
+              <w:left w:w="100" w:type="dxa"/>
+              <w:bottom w:w="100" w:type="dxa"/>
+              <w:right w:w="100" w:type="dxa"/>
+            </w:tcMar>
+            <w:shd w:fill="FFFFFF"/>
+            <w:tcBorders>
+              <w:top w:val="single" w:sz="4" w:color="D9D9D9"/>
+              <w:left w:val="single" w:sz="4" w:color="D9D9D9"/>
+              <w:bottom w:val="single" w:sz="4" w:color="D9D9D9"/>
+              <w:right w:val="single" w:sz="4" w:color="D9D9D9"/>
+            </w:tcBorders>
+          </w:tcPr>
+          <w:p>
+            <w:pPr>
+              <w:spacing w:after="40" w:line="252" w:lineRule="auto"/>
+            </w:pPr>
+            <w:r>
+              <w:rPr>
+                <w:rFonts w:ascii="Calibri" w:hAnsi="Calibri"/>
+                <w:b w:val="0"/>
+                <w:color w:val="000000"/>
+                <w:sz w:val="18"/>
+              </w:rPr>
+              <w:t>react</w:t>
+            </w:r>
+          </w:p>
+        </w:tc>
+        <w:tc>
+          <w:tcPr>
+            <w:tcW w:type="dxa" w:w="1300"/>
+            <w:vAlign w:val="center"/>
+            <w:tcMar>
+              <w:top w:w="100" w:type="dxa"/>
+              <w:left w:w="100" w:type="dxa"/>
+              <w:bottom w:w="100" w:type="dxa"/>
+              <w:right w:w="100" w:type="dxa"/>
+            </w:tcMar>
+            <w:shd w:fill="FFFFFF"/>
+            <w:tcBorders>
+              <w:top w:val="single" w:sz="4" w:color="D9D9D9"/>
+              <w:left w:val="single" w:sz="4" w:color="D9D9D9"/>
+              <w:bottom w:val="single" w:sz="4" w:color="D9D9D9"/>
+              <w:right w:val="single" w:sz="4" w:color="D9D9D9"/>
+            </w:tcBorders>
+          </w:tcPr>
+          <w:p>
+            <w:pPr>
+              <w:spacing w:after="40" w:line="252" w:lineRule="auto"/>
+              <w:jc w:val="center"/>
+            </w:pPr>
+            <w:r>
+              <w:rPr>
+                <w:rFonts w:ascii="Calibri" w:hAnsi="Calibri"/>
+                <w:b w:val="0"/>
+                <w:color w:val="000000"/>
+                <w:sz w:val="18"/>
+              </w:rPr>
+              <w:t>^19</w:t>
+            </w:r>
+          </w:p>
+        </w:tc>
+        <w:tc>
+          <w:tcPr>
+            <w:tcW w:type="dxa" w:w="1300"/>
+            <w:vAlign w:val="center"/>
+            <w:tcMar>
+              <w:top w:w="100" w:type="dxa"/>
+              <w:left w:w="100" w:type="dxa"/>
+              <w:bottom w:w="100" w:type="dxa"/>
+              <w:right w:w="100" w:type="dxa"/>
+            </w:tcMar>
+            <w:shd w:fill="FFFFFF"/>
+            <w:tcBorders>
+              <w:top w:val="single" w:sz="4" w:color="D9D9D9"/>
+              <w:left w:val="single" w:sz="4" w:color="D9D9D9"/>
+              <w:bottom w:val="single" w:sz="4" w:color="D9D9D9"/>
+              <w:right w:val="single" w:sz="4" w:color="D9D9D9"/>
+            </w:tcBorders>
+          </w:tcPr>
+          <w:p>
+            <w:pPr>
+              <w:spacing w:after="40" w:line="252" w:lineRule="auto"/>
+              <w:jc w:val="center"/>
+            </w:pPr>
+            <w:r>
+              <w:rPr>
+                <w:rFonts w:ascii="Calibri" w:hAnsi="Calibri"/>
+                <w:b w:val="0"/>
+                <w:color w:val="000000"/>
+                <w:sz w:val="18"/>
+              </w:rPr>
+              <w:t>19.2.6</w:t>
+            </w:r>
+          </w:p>
+        </w:tc>
+        <w:tc>
+          <w:tcPr>
+            <w:tcW w:type="dxa" w:w="5500"/>
+            <w:vAlign w:val="center"/>
+            <w:tcMar>
+              <w:top w:w="100" w:type="dxa"/>
+              <w:left w:w="100" w:type="dxa"/>
+              <w:bottom w:w="100" w:type="dxa"/>
+              <w:right w:w="100" w:type="dxa"/>
+            </w:tcMar>
+            <w:shd w:fill="FFFFFF"/>
+            <w:tcBorders>
+              <w:top w:val="single" w:sz="4" w:color="D9D9D9"/>
+              <w:left w:val="single" w:sz="4" w:color="D9D9D9"/>
+              <w:bottom w:val="single" w:sz="4" w:color="D9D9D9"/>
+              <w:right w:val="single" w:sz="4" w:color="D9D9D9"/>
+            </w:tcBorders>
+          </w:tcPr>
+          <w:p>
+            <w:pPr>
+              <w:spacing w:after="40" w:line="252" w:lineRule="auto"/>
+            </w:pPr>
+            <w:r>
+              <w:rPr>
+                <w:rFonts w:ascii="Calibri" w:hAnsi="Calibri"/>
+                <w:b w:val="0"/>
+                <w:color w:val="000000"/>
+                <w:sz w:val="18"/>
+              </w:rPr>
+              <w:t>Componentes, estado y efectos de las pantallas.</w:t>
+            </w:r>
+          </w:p>
+        </w:tc>
+      </w:tr>
+      <w:tr>
+        <w:trPr>
+          <w:cantSplit/>
+        </w:trPr>
+        <w:tc>
+          <w:tcPr>
+            <w:tcW w:type="dxa" w:w="2200"/>
+            <w:vAlign w:val="center"/>
+            <w:tcMar>
+              <w:top w:w="100" w:type="dxa"/>
+              <w:left w:w="100" w:type="dxa"/>
+              <w:bottom w:w="100" w:type="dxa"/>
+              <w:right w:w="100" w:type="dxa"/>
+            </w:tcMar>
+            <w:shd w:fill="F2F5F8"/>
+            <w:tcBorders>
+              <w:top w:val="single" w:sz="4" w:color="D9D9D9"/>
+              <w:left w:val="single" w:sz="4" w:color="D9D9D9"/>
+              <w:bottom w:val="single" w:sz="4" w:color="D9D9D9"/>
+              <w:right w:val="single" w:sz="4" w:color="D9D9D9"/>
+            </w:tcBorders>
+          </w:tcPr>
+          <w:p>
+            <w:pPr>
+              <w:spacing w:after="40" w:line="252" w:lineRule="auto"/>
+            </w:pPr>
+            <w:r>
+              <w:rPr>
+                <w:rFonts w:ascii="Calibri" w:hAnsi="Calibri"/>
+                <w:b w:val="0"/>
+                <w:color w:val="000000"/>
+                <w:sz w:val="18"/>
+              </w:rPr>
+              <w:t>react-dom</w:t>
+            </w:r>
+          </w:p>
+        </w:tc>
+        <w:tc>
+          <w:tcPr>
+            <w:tcW w:type="dxa" w:w="1300"/>
+            <w:vAlign w:val="center"/>
+            <w:tcMar>
+              <w:top w:w="100" w:type="dxa"/>
+              <w:left w:w="100" w:type="dxa"/>
+              <w:bottom w:w="100" w:type="dxa"/>
+              <w:right w:w="100" w:type="dxa"/>
+            </w:tcMar>
+            <w:shd w:fill="F2F5F8"/>
+            <w:tcBorders>
+              <w:top w:val="single" w:sz="4" w:color="D9D9D9"/>
+              <w:left w:val="single" w:sz="4" w:color="D9D9D9"/>
+              <w:bottom w:val="single" w:sz="4" w:color="D9D9D9"/>
+              <w:right w:val="single" w:sz="4" w:color="D9D9D9"/>
+            </w:tcBorders>
+          </w:tcPr>
+          <w:p>
+            <w:pPr>
+              <w:spacing w:after="40" w:line="252" w:lineRule="auto"/>
+              <w:jc w:val="center"/>
+            </w:pPr>
+            <w:r>
+              <w:rPr>
+                <w:rFonts w:ascii="Calibri" w:hAnsi="Calibri"/>
+                <w:b w:val="0"/>
+                <w:color w:val="000000"/>
+                <w:sz w:val="18"/>
+              </w:rPr>
+              <w:t>^19</w:t>
+            </w:r>
+          </w:p>
+        </w:tc>
+        <w:tc>
+          <w:tcPr>
+            <w:tcW w:type="dxa" w:w="1300"/>
+            <w:vAlign w:val="center"/>
+            <w:tcMar>
+              <w:top w:w="100" w:type="dxa"/>
+              <w:left w:w="100" w:type="dxa"/>
+              <w:bottom w:w="100" w:type="dxa"/>
+              <w:right w:w="100" w:type="dxa"/>
+            </w:tcMar>
+            <w:shd w:fill="F2F5F8"/>
+            <w:tcBorders>
+              <w:top w:val="single" w:sz="4" w:color="D9D9D9"/>
+              <w:left w:val="single" w:sz="4" w:color="D9D9D9"/>
+              <w:bottom w:val="single" w:sz="4" w:color="D9D9D9"/>
+              <w:right w:val="single" w:sz="4" w:color="D9D9D9"/>
+            </w:tcBorders>
+          </w:tcPr>
+          <w:p>
+            <w:pPr>
+              <w:spacing w:after="40" w:line="252" w:lineRule="auto"/>
+              <w:jc w:val="center"/>
+            </w:pPr>
+            <w:r>
+              <w:rPr>
+                <w:rFonts w:ascii="Calibri" w:hAnsi="Calibri"/>
+                <w:b w:val="0"/>
+                <w:color w:val="000000"/>
+                <w:sz w:val="18"/>
+              </w:rPr>
+              <w:t>19.2.6</w:t>
+            </w:r>
+          </w:p>
+        </w:tc>
+        <w:tc>
+          <w:tcPr>
+            <w:tcW w:type="dxa" w:w="5500"/>
+            <w:vAlign w:val="center"/>
+            <w:tcMar>
+              <w:top w:w="100" w:type="dxa"/>
+              <w:left w:w="100" w:type="dxa"/>
+              <w:bottom w:w="100" w:type="dxa"/>
+              <w:right w:w="100" w:type="dxa"/>
+            </w:tcMar>
+            <w:shd w:fill="F2F5F8"/>
+            <w:tcBorders>
+              <w:top w:val="single" w:sz="4" w:color="D9D9D9"/>
+              <w:left w:val="single" w:sz="4" w:color="D9D9D9"/>
+              <w:bottom w:val="single" w:sz="4" w:color="D9D9D9"/>
+              <w:right w:val="single" w:sz="4" w:color="D9D9D9"/>
+            </w:tcBorders>
+          </w:tcPr>
+          <w:p>
+            <w:pPr>
+              <w:spacing w:after="40" w:line="252" w:lineRule="auto"/>
+            </w:pPr>
+            <w:r>
+              <w:rPr>
+                <w:rFonts w:ascii="Calibri" w:hAnsi="Calibri"/>
+                <w:b w:val="0"/>
+                <w:color w:val="000000"/>
+                <w:sz w:val="18"/>
+              </w:rPr>
+              <w:t>Montaje de React mediante createRoot en src/main.jsx.</w:t>
+            </w:r>
+          </w:p>
+        </w:tc>
+      </w:tr>
+      <w:tr>
+        <w:trPr>
+          <w:cantSplit/>
+        </w:trPr>
+        <w:tc>
+          <w:tcPr>
+            <w:tcW w:type="dxa" w:w="2200"/>
+            <w:vAlign w:val="center"/>
+            <w:tcMar>
+              <w:top w:w="100" w:type="dxa"/>
+              <w:left w:w="100" w:type="dxa"/>
+              <w:bottom w:w="100" w:type="dxa"/>
+              <w:right w:w="100" w:type="dxa"/>
+            </w:tcMar>
+            <w:shd w:fill="FFFFFF"/>
+            <w:tcBorders>
+              <w:top w:val="single" w:sz="4" w:color="D9D9D9"/>
+              <w:left w:val="single" w:sz="4" w:color="D9D9D9"/>
+              <w:bottom w:val="single" w:sz="4" w:color="D9D9D9"/>
+              <w:right w:val="single" w:sz="4" w:color="D9D9D9"/>
+            </w:tcBorders>
+          </w:tcPr>
+          <w:p>
+            <w:pPr>
+              <w:spacing w:after="40" w:line="252" w:lineRule="auto"/>
+            </w:pPr>
+            <w:r>
+              <w:rPr>
+                <w:rFonts w:ascii="Calibri" w:hAnsi="Calibri"/>
+                <w:b w:val="0"/>
+                <w:color w:val="000000"/>
+                <w:sz w:val="18"/>
+              </w:rPr>
+              <w:t>react-router-dom</w:t>
+            </w:r>
+          </w:p>
+        </w:tc>
+        <w:tc>
+          <w:tcPr>
+            <w:tcW w:type="dxa" w:w="1300"/>
+            <w:vAlign w:val="center"/>
+            <w:tcMar>
+              <w:top w:w="100" w:type="dxa"/>
+              <w:left w:w="100" w:type="dxa"/>
+              <w:bottom w:w="100" w:type="dxa"/>
+              <w:right w:w="100" w:type="dxa"/>
+            </w:tcMar>
+            <w:shd w:fill="FFFFFF"/>
+            <w:tcBorders>
+              <w:top w:val="single" w:sz="4" w:color="D9D9D9"/>
+              <w:left w:val="single" w:sz="4" w:color="D9D9D9"/>
+              <w:bottom w:val="single" w:sz="4" w:color="D9D9D9"/>
+              <w:right w:val="single" w:sz="4" w:color="D9D9D9"/>
+            </w:tcBorders>
+          </w:tcPr>
+          <w:p>
+            <w:pPr>
+              <w:spacing w:after="40" w:line="252" w:lineRule="auto"/>
+              <w:jc w:val="center"/>
+            </w:pPr>
+            <w:r>
+              <w:rPr>
+                <w:rFonts w:ascii="Calibri" w:hAnsi="Calibri"/>
+                <w:b w:val="0"/>
+                <w:color w:val="000000"/>
+                <w:sz w:val="18"/>
+              </w:rPr>
+              <w:t>^7.18.1</w:t>
+            </w:r>
+          </w:p>
+        </w:tc>
+        <w:tc>
+          <w:tcPr>
+            <w:tcW w:type="dxa" w:w="1300"/>
+            <w:vAlign w:val="center"/>
+            <w:tcMar>
+              <w:top w:w="100" w:type="dxa"/>
+              <w:left w:w="100" w:type="dxa"/>
+              <w:bottom w:w="100" w:type="dxa"/>
+              <w:right w:w="100" w:type="dxa"/>
+            </w:tcMar>
+            <w:shd w:fill="FFFFFF"/>
+            <w:tcBorders>
+              <w:top w:val="single" w:sz="4" w:color="D9D9D9"/>
+              <w:left w:val="single" w:sz="4" w:color="D9D9D9"/>
+              <w:bottom w:val="single" w:sz="4" w:color="D9D9D9"/>
+              <w:right w:val="single" w:sz="4" w:color="D9D9D9"/>
+            </w:tcBorders>
+          </w:tcPr>
+          <w:p>
+            <w:pPr>
+              <w:spacing w:after="40" w:line="252" w:lineRule="auto"/>
+              <w:jc w:val="center"/>
+            </w:pPr>
+            <w:r>
+              <w:rPr>
+                <w:rFonts w:ascii="Calibri" w:hAnsi="Calibri"/>
+                <w:b w:val="0"/>
+                <w:color w:val="000000"/>
+                <w:sz w:val="18"/>
+              </w:rPr>
+              <w:t>7.18.2</w:t>
+            </w:r>
+          </w:p>
+        </w:tc>
+        <w:tc>
+          <w:tcPr>
+            <w:tcW w:type="dxa" w:w="5500"/>
+            <w:vAlign w:val="center"/>
+            <w:tcMar>
+              <w:top w:w="100" w:type="dxa"/>
+              <w:left w:w="100" w:type="dxa"/>
+              <w:bottom w:w="100" w:type="dxa"/>
+              <w:right w:w="100" w:type="dxa"/>
+            </w:tcMar>
+            <w:shd w:fill="FFFFFF"/>
+            <w:tcBorders>
+              <w:top w:val="single" w:sz="4" w:color="D9D9D9"/>
+              <w:left w:val="single" w:sz="4" w:color="D9D9D9"/>
+              <w:bottom w:val="single" w:sz="4" w:color="D9D9D9"/>
+              <w:right w:val="single" w:sz="4" w:color="D9D9D9"/>
+            </w:tcBorders>
+          </w:tcPr>
+          <w:p>
+            <w:pPr>
+              <w:spacing w:after="40" w:line="252" w:lineRule="auto"/>
+            </w:pPr>
+            <w:r>
+              <w:rPr>
+                <w:rFonts w:ascii="Calibri" w:hAnsi="Calibri"/>
+                <w:b w:val="0"/>
+                <w:color w:val="000000"/>
+                <w:sz w:val="18"/>
+              </w:rPr>
+              <w:t>Navegación, rutas y redirecciones de sesión en App.jsx.</w:t>
+            </w:r>
+          </w:p>
+        </w:tc>
+      </w:tr>
+    </w:tbl>
+    <w:p xmlns:w="http://schemas.openxmlformats.org/wordprocessingml/2006/main" xmlns:wpc="http://schemas.microsoft.com/office/word/2010/wordprocessingCanvas" xmlns:mo="http://schemas.microsoft.com/office/mac/office/2008/main" xmlns:mc="http://schemas.openxmlformats.org/markup-compatibility/2006" xmlns:mv="urn:schemas-microsoft-com:mac:vml" xmlns:o="urn:schemas-microsoft-com:office:office" xmlns:r="http://schemas.openxmlformats.org/officeDocument/2006/relationships" xmlns:m="http://schemas.openxmlformats.org/officeDocument/2006/math" xmlns:v="urn:schemas-microsoft-com:vml" xmlns:wp14="http://schemas.microsoft.com/office/word/2010/wordprocessingDrawing" xmlns:wp="http://schemas.openxmlformats.org/drawingml/2006/wordprocessingDrawing" xmlns:w10="urn:schemas-microsoft-com:office:word" xmlns:w14="http://schemas.microsoft.com/office/word/2010/wordml" xmlns:wpg="http://schemas.microsoft.com/office/word/2010/wordprocessingGroup" xmlns:wpi="http://schemas.microsoft.com/office/word/2010/wordprocessingInk" xmlns:wne="http://schemas.microsoft.com/office/word/2006/wordml" xmlns:wps="http://schemas.microsoft.com/office/word/2010/wordprocessingShape">
+      <w:pPr>
+        <w:keepNext/>
+        <w:spacing w:after="140" w:line="259" w:lineRule="auto" w:before="200"/>
+      </w:pPr>
+      <w:r>
+        <w:rPr>
+          <w:rFonts w:ascii="Calibri" w:hAnsi="Calibri"/>
+          <w:b/>
+          <w:color w:val="000000"/>
+          <w:sz w:val="24"/>
+        </w:rPr>
+        <w:t>5 3 Herramientas de desarrollo</w:t>
+      </w:r>
+    </w:p>
+    <w:tbl xmlns:w="http://schemas.openxmlformats.org/wordprocessingml/2006/main" xmlns:wpc="http://schemas.microsoft.com/office/word/2010/wordprocessingCanvas" xmlns:mo="http://schemas.microsoft.com/office/mac/office/2008/main" xmlns:mc="http://schemas.openxmlformats.org/markup-compatibility/2006" xmlns:mv="urn:schemas-microsoft-com:mac:vml" xmlns:o="urn:schemas-microsoft-com:office:office" xmlns:r="http://schemas.openxmlformats.org/officeDocument/2006/relationships" xmlns:m="http://schemas.openxmlformats.org/officeDocument/2006/math" xmlns:v="urn:schemas-microsoft-com:vml" xmlns:wp14="http://schemas.microsoft.com/office/word/2010/wordprocessingDrawing" xmlns:wp="http://schemas.openxmlformats.org/drawingml/2006/wordprocessingDrawing" xmlns:w10="urn:schemas-microsoft-com:office:word" xmlns:w14="http://schemas.microsoft.com/office/word/2010/wordml" xmlns:wpg="http://schemas.microsoft.com/office/word/2010/wordprocessingGroup" xmlns:wpi="http://schemas.microsoft.com/office/word/2010/wordprocessingInk" xmlns:wne="http://schemas.microsoft.com/office/word/2006/wordml" xmlns:wps="http://schemas.microsoft.com/office/word/2010/wordprocessingShape">
+      <w:tblPr>
+        <w:tblW w:type="auto" w:w="0"/>
+        <w:tblLayout w:type="fixed"/>
+        <w:tblLook w:firstColumn="1" w:firstRow="1" w:lastColumn="0" w:lastRow="0" w:noHBand="0" w:noVBand="1" w:val="04A0"/>
+      </w:tblPr>
+      <w:tblGrid>
+        <w:gridCol w:w="2200"/>
+        <w:gridCol w:w="1300"/>
+        <w:gridCol w:w="1300"/>
+        <w:gridCol w:w="5500"/>
+      </w:tblGrid>
+      <w:tr>
+        <w:trPr>
+          <w:tblHeader/>
+          <w:cantSplit/>
+        </w:trPr>
+        <w:tc>
+          <w:tcPr>
+            <w:tcW w:type="dxa" w:w="2200"/>
+            <w:vAlign w:val="center"/>
+            <w:tcMar>
+              <w:top w:w="100" w:type="dxa"/>
+              <w:left w:w="100" w:type="dxa"/>
+              <w:bottom w:w="100" w:type="dxa"/>
+              <w:right w:w="100" w:type="dxa"/>
+            </w:tcMar>
+            <w:shd w:fill="16365C"/>
+            <w:tcBorders>
+              <w:top w:val="single" w:sz="4" w:color="D9D9D9"/>
+              <w:left w:val="single" w:sz="4" w:color="D9D9D9"/>
+              <w:bottom w:val="single" w:sz="4" w:color="D9D9D9"/>
+              <w:right w:val="single" w:sz="4" w:color="D9D9D9"/>
+            </w:tcBorders>
+          </w:tcPr>
+          <w:p>
+            <w:pPr>
+              <w:spacing w:after="40" w:line="252" w:lineRule="auto"/>
+            </w:pPr>
+            <w:r>
+              <w:rPr>
+                <w:rFonts w:ascii="Calibri" w:hAnsi="Calibri"/>
+                <w:b/>
+                <w:color w:val="FFFFFF"/>
+                <w:sz w:val="18"/>
+              </w:rPr>
+              <w:t>Paquete</w:t>
+            </w:r>
+          </w:p>
+        </w:tc>
+        <w:tc>
+          <w:tcPr>
+            <w:tcW w:type="dxa" w:w="1300"/>
+            <w:vAlign w:val="center"/>
+            <w:tcMar>
+              <w:top w:w="100" w:type="dxa"/>
+              <w:left w:w="100" w:type="dxa"/>
+              <w:bottom w:w="100" w:type="dxa"/>
+              <w:right w:w="100" w:type="dxa"/>
+            </w:tcMar>
+            <w:shd w:fill="16365C"/>
+            <w:tcBorders>
+              <w:top w:val="single" w:sz="4" w:color="D9D9D9"/>
+              <w:left w:val="single" w:sz="4" w:color="D9D9D9"/>
+              <w:bottom w:val="single" w:sz="4" w:color="D9D9D9"/>
+              <w:right w:val="single" w:sz="4" w:color="D9D9D9"/>
+            </w:tcBorders>
+          </w:tcPr>
+          <w:p>
+            <w:pPr>
+              <w:spacing w:after="40" w:line="252" w:lineRule="auto"/>
+              <w:jc w:val="center"/>
+            </w:pPr>
+            <w:r>
+              <w:rPr>
+                <w:rFonts w:ascii="Calibri" w:hAnsi="Calibri"/>
+                <w:b/>
+                <w:color w:val="FFFFFF"/>
+                <w:sz w:val="18"/>
+              </w:rPr>
+              <w:t>Declarada</w:t>
+            </w:r>
+          </w:p>
+        </w:tc>
+        <w:tc>
+          <w:tcPr>
+            <w:tcW w:type="dxa" w:w="1300"/>
+            <w:vAlign w:val="center"/>
+            <w:tcMar>
+              <w:top w:w="100" w:type="dxa"/>
+              <w:left w:w="100" w:type="dxa"/>
+              <w:bottom w:w="100" w:type="dxa"/>
+              <w:right w:w="100" w:type="dxa"/>
+            </w:tcMar>
+            <w:shd w:fill="16365C"/>
+            <w:tcBorders>
+              <w:top w:val="single" w:sz="4" w:color="D9D9D9"/>
+              <w:left w:val="single" w:sz="4" w:color="D9D9D9"/>
+              <w:bottom w:val="single" w:sz="4" w:color="D9D9D9"/>
+              <w:right w:val="single" w:sz="4" w:color="D9D9D9"/>
+            </w:tcBorders>
+          </w:tcPr>
+          <w:p>
+            <w:pPr>
+              <w:spacing w:after="40" w:line="252" w:lineRule="auto"/>
+              <w:jc w:val="center"/>
+            </w:pPr>
+            <w:r>
+              <w:rPr>
+                <w:rFonts w:ascii="Calibri" w:hAnsi="Calibri"/>
+                <w:b/>
+                <w:color w:val="FFFFFF"/>
+                <w:sz w:val="18"/>
+              </w:rPr>
+              <w:t>Fijada</w:t>
+            </w:r>
+          </w:p>
+        </w:tc>
+        <w:tc>
+          <w:tcPr>
+            <w:tcW w:type="dxa" w:w="5500"/>
+            <w:vAlign w:val="center"/>
+            <w:tcMar>
+              <w:top w:w="100" w:type="dxa"/>
+              <w:left w:w="100" w:type="dxa"/>
+              <w:bottom w:w="100" w:type="dxa"/>
+              <w:right w:w="100" w:type="dxa"/>
+            </w:tcMar>
+            <w:shd w:fill="16365C"/>
+            <w:tcBorders>
+              <w:top w:val="single" w:sz="4" w:color="D9D9D9"/>
+              <w:left w:val="single" w:sz="4" w:color="D9D9D9"/>
+              <w:bottom w:val="single" w:sz="4" w:color="D9D9D9"/>
+              <w:right w:val="single" w:sz="4" w:color="D9D9D9"/>
+            </w:tcBorders>
+          </w:tcPr>
+          <w:p>
+            <w:pPr>
+              <w:spacing w:after="40" w:line="252" w:lineRule="auto"/>
+            </w:pPr>
+            <w:r>
+              <w:rPr>
+                <w:rFonts w:ascii="Calibri" w:hAnsi="Calibri"/>
+                <w:b/>
+                <w:color w:val="FFFFFF"/>
+                <w:sz w:val="18"/>
+              </w:rPr>
+              <w:t>Uso en Biblioteca Tec</w:t>
+            </w:r>
+          </w:p>
+        </w:tc>
+      </w:tr>
+      <w:tr>
+        <w:trPr>
+          <w:cantSplit/>
+        </w:trPr>
+        <w:tc>
+          <w:tcPr>
+            <w:tcW w:type="dxa" w:w="2200"/>
+            <w:vAlign w:val="center"/>
+            <w:tcMar>
+              <w:top w:w="100" w:type="dxa"/>
+              <w:left w:w="100" w:type="dxa"/>
+              <w:bottom w:w="100" w:type="dxa"/>
+              <w:right w:w="100" w:type="dxa"/>
+            </w:tcMar>
+            <w:shd w:fill="FFFFFF"/>
+            <w:tcBorders>
+              <w:top w:val="single" w:sz="4" w:color="D9D9D9"/>
+              <w:left w:val="single" w:sz="4" w:color="D9D9D9"/>
+              <w:bottom w:val="single" w:sz="4" w:color="D9D9D9"/>
+              <w:right w:val="single" w:sz="4" w:color="D9D9D9"/>
+            </w:tcBorders>
+          </w:tcPr>
+          <w:p>
+            <w:pPr>
+              <w:spacing w:after="40" w:line="252" w:lineRule="auto"/>
+            </w:pPr>
+            <w:r>
+              <w:rPr>
+                <w:rFonts w:ascii="Calibri" w:hAnsi="Calibri"/>
+                <w:b w:val="0"/>
+                <w:color w:val="000000"/>
+                <w:sz w:val="18"/>
+              </w:rPr>
+              <w:t>vite</w:t>
+            </w:r>
+          </w:p>
+        </w:tc>
+        <w:tc>
+          <w:tcPr>
+            <w:tcW w:type="dxa" w:w="1300"/>
+            <w:vAlign w:val="center"/>
+            <w:tcMar>
+              <w:top w:w="100" w:type="dxa"/>
+              <w:left w:w="100" w:type="dxa"/>
+              <w:bottom w:w="100" w:type="dxa"/>
+              <w:right w:w="100" w:type="dxa"/>
+            </w:tcMar>
+            <w:shd w:fill="FFFFFF"/>
+            <w:tcBorders>
+              <w:top w:val="single" w:sz="4" w:color="D9D9D9"/>
+              <w:left w:val="single" w:sz="4" w:color="D9D9D9"/>
+              <w:bottom w:val="single" w:sz="4" w:color="D9D9D9"/>
+              <w:right w:val="single" w:sz="4" w:color="D9D9D9"/>
+            </w:tcBorders>
+          </w:tcPr>
+          <w:p>
+            <w:pPr>
+              <w:spacing w:after="40" w:line="252" w:lineRule="auto"/>
+              <w:jc w:val="center"/>
+            </w:pPr>
+            <w:r>
+              <w:rPr>
+                <w:rFonts w:ascii="Calibri" w:hAnsi="Calibri"/>
+                <w:b w:val="0"/>
+                <w:color w:val="000000"/>
+                <w:sz w:val="18"/>
+              </w:rPr>
+              <w:t>^6.0.0</w:t>
+            </w:r>
+          </w:p>
+        </w:tc>
+        <w:tc>
+          <w:tcPr>
+            <w:tcW w:type="dxa" w:w="1300"/>
+            <w:vAlign w:val="center"/>
+            <w:tcMar>
+              <w:top w:w="100" w:type="dxa"/>
+              <w:left w:w="100" w:type="dxa"/>
+              <w:bottom w:w="100" w:type="dxa"/>
+              <w:right w:w="100" w:type="dxa"/>
+            </w:tcMar>
+            <w:shd w:fill="FFFFFF"/>
+            <w:tcBorders>
+              <w:top w:val="single" w:sz="4" w:color="D9D9D9"/>
+              <w:left w:val="single" w:sz="4" w:color="D9D9D9"/>
+              <w:bottom w:val="single" w:sz="4" w:color="D9D9D9"/>
+              <w:right w:val="single" w:sz="4" w:color="D9D9D9"/>
+            </w:tcBorders>
+          </w:tcPr>
+          <w:p>
+            <w:pPr>
+              <w:spacing w:after="40" w:line="252" w:lineRule="auto"/>
+              <w:jc w:val="center"/>
+            </w:pPr>
+            <w:r>
+              <w:rPr>
+                <w:rFonts w:ascii="Calibri" w:hAnsi="Calibri"/>
+                <w:b w:val="0"/>
+                <w:color w:val="000000"/>
+                <w:sz w:val="18"/>
+              </w:rPr>
+              <w:t>6.4.3</w:t>
+            </w:r>
+          </w:p>
+        </w:tc>
+        <w:tc>
+          <w:tcPr>
+            <w:tcW w:type="dxa" w:w="5500"/>
+            <w:vAlign w:val="center"/>
+            <w:tcMar>
+              <w:top w:w="100" w:type="dxa"/>
+              <w:left w:w="100" w:type="dxa"/>
+              <w:bottom w:w="100" w:type="dxa"/>
+              <w:right w:w="100" w:type="dxa"/>
+            </w:tcMar>
+            <w:shd w:fill="FFFFFF"/>
+            <w:tcBorders>
+              <w:top w:val="single" w:sz="4" w:color="D9D9D9"/>
+              <w:left w:val="single" w:sz="4" w:color="D9D9D9"/>
+              <w:bottom w:val="single" w:sz="4" w:color="D9D9D9"/>
+              <w:right w:val="single" w:sz="4" w:color="D9D9D9"/>
+            </w:tcBorders>
+          </w:tcPr>
+          <w:p>
+            <w:pPr>
+              <w:spacing w:after="40" w:line="252" w:lineRule="auto"/>
+            </w:pPr>
+            <w:r>
+              <w:rPr>
+                <w:rFonts w:ascii="Calibri" w:hAnsi="Calibri"/>
+                <w:b w:val="0"/>
+                <w:color w:val="000000"/>
+                <w:sz w:val="18"/>
+              </w:rPr>
+              <w:t>Servidor de desarrollo, proxy local de /api y compilación estática a dist.</w:t>
+            </w:r>
+          </w:p>
+        </w:tc>
+      </w:tr>
+      <w:tr>
+        <w:trPr>
+          <w:cantSplit/>
+        </w:trPr>
+        <w:tc>
+          <w:tcPr>
+            <w:tcW w:type="dxa" w:w="2200"/>
+            <w:vAlign w:val="center"/>
+            <w:tcMar>
+              <w:top w:w="100" w:type="dxa"/>
+              <w:left w:w="100" w:type="dxa"/>
+              <w:bottom w:w="100" w:type="dxa"/>
+              <w:right w:w="100" w:type="dxa"/>
+            </w:tcMar>
+            <w:shd w:fill="F2F5F8"/>
+            <w:tcBorders>
+              <w:top w:val="single" w:sz="4" w:color="D9D9D9"/>
+              <w:left w:val="single" w:sz="4" w:color="D9D9D9"/>
+              <w:bottom w:val="single" w:sz="4" w:color="D9D9D9"/>
+              <w:right w:val="single" w:sz="4" w:color="D9D9D9"/>
+            </w:tcBorders>
+          </w:tcPr>
+          <w:p>
+            <w:pPr>
+              <w:spacing w:after="40" w:line="252" w:lineRule="auto"/>
+            </w:pPr>
+            <w:r>
+              <w:rPr>
+                <w:rFonts w:ascii="Calibri" w:hAnsi="Calibri"/>
+                <w:b w:val="0"/>
+                <w:color w:val="000000"/>
+                <w:sz w:val="18"/>
+              </w:rPr>
+              <w:t>@vitejs/plugin-react</w:t>
+            </w:r>
+          </w:p>
+        </w:tc>
+        <w:tc>
+          <w:tcPr>
+            <w:tcW w:type="dxa" w:w="1300"/>
+            <w:vAlign w:val="center"/>
+            <w:tcMar>
+              <w:top w:w="100" w:type="dxa"/>
+              <w:left w:w="100" w:type="dxa"/>
+              <w:bottom w:w="100" w:type="dxa"/>
+              <w:right w:w="100" w:type="dxa"/>
+            </w:tcMar>
+            <w:shd w:fill="F2F5F8"/>
+            <w:tcBorders>
+              <w:top w:val="single" w:sz="4" w:color="D9D9D9"/>
+              <w:left w:val="single" w:sz="4" w:color="D9D9D9"/>
+              <w:bottom w:val="single" w:sz="4" w:color="D9D9D9"/>
+              <w:right w:val="single" w:sz="4" w:color="D9D9D9"/>
+            </w:tcBorders>
+          </w:tcPr>
+          <w:p>
+            <w:pPr>
+              <w:spacing w:after="40" w:line="252" w:lineRule="auto"/>
+              <w:jc w:val="center"/>
+            </w:pPr>
+            <w:r>
+              <w:rPr>
+                <w:rFonts w:ascii="Calibri" w:hAnsi="Calibri"/>
+                <w:b w:val="0"/>
+                <w:color w:val="000000"/>
+                <w:sz w:val="18"/>
+              </w:rPr>
+              <w:t>^4.3.4</w:t>
+            </w:r>
+          </w:p>
+        </w:tc>
+        <w:tc>
+          <w:tcPr>
+            <w:tcW w:type="dxa" w:w="1300"/>
+            <w:vAlign w:val="center"/>
+            <w:tcMar>
+              <w:top w:w="100" w:type="dxa"/>
+              <w:left w:w="100" w:type="dxa"/>
+              <w:bottom w:w="100" w:type="dxa"/>
+              <w:right w:w="100" w:type="dxa"/>
+            </w:tcMar>
+            <w:shd w:fill="F2F5F8"/>
+            <w:tcBorders>
+              <w:top w:val="single" w:sz="4" w:color="D9D9D9"/>
+              <w:left w:val="single" w:sz="4" w:color="D9D9D9"/>
+              <w:bottom w:val="single" w:sz="4" w:color="D9D9D9"/>
+              <w:right w:val="single" w:sz="4" w:color="D9D9D9"/>
+            </w:tcBorders>
+          </w:tcPr>
+          <w:p>
+            <w:pPr>
+              <w:spacing w:after="40" w:line="252" w:lineRule="auto"/>
+              <w:jc w:val="center"/>
+            </w:pPr>
+            <w:r>
+              <w:rPr>
+                <w:rFonts w:ascii="Calibri" w:hAnsi="Calibri"/>
+                <w:b w:val="0"/>
+                <w:color w:val="000000"/>
+                <w:sz w:val="18"/>
+              </w:rPr>
+              <w:t>4.7.0</w:t>
+            </w:r>
+          </w:p>
+        </w:tc>
+        <w:tc>
+          <w:tcPr>
+            <w:tcW w:type="dxa" w:w="5500"/>
+            <w:vAlign w:val="center"/>
+            <w:tcMar>
+              <w:top w:w="100" w:type="dxa"/>
+              <w:left w:w="100" w:type="dxa"/>
+              <w:bottom w:w="100" w:type="dxa"/>
+              <w:right w:w="100" w:type="dxa"/>
+            </w:tcMar>
+            <w:shd w:fill="F2F5F8"/>
+            <w:tcBorders>
+              <w:top w:val="single" w:sz="4" w:color="D9D9D9"/>
+              <w:left w:val="single" w:sz="4" w:color="D9D9D9"/>
+              <w:bottom w:val="single" w:sz="4" w:color="D9D9D9"/>
+              <w:right w:val="single" w:sz="4" w:color="D9D9D9"/>
+            </w:tcBorders>
+          </w:tcPr>
+          <w:p>
+            <w:pPr>
+              <w:spacing w:after="40" w:line="252" w:lineRule="auto"/>
+            </w:pPr>
+            <w:r>
+              <w:rPr>
+                <w:rFonts w:ascii="Calibri" w:hAnsi="Calibri"/>
+                <w:b w:val="0"/>
+                <w:color w:val="000000"/>
+                <w:sz w:val="18"/>
+              </w:rPr>
+              <w:t>Transformación de JSX e integración de React con Vite.</w:t>
+            </w:r>
+          </w:p>
+        </w:tc>
+      </w:tr>
+      <w:tr>
+        <w:trPr>
+          <w:cantSplit/>
+        </w:trPr>
+        <w:tc>
+          <w:tcPr>
+            <w:tcW w:type="dxa" w:w="2200"/>
+            <w:vAlign w:val="center"/>
+            <w:tcMar>
+              <w:top w:w="100" w:type="dxa"/>
+              <w:left w:w="100" w:type="dxa"/>
+              <w:bottom w:w="100" w:type="dxa"/>
+              <w:right w:w="100" w:type="dxa"/>
+            </w:tcMar>
+            <w:shd w:fill="FFFFFF"/>
+            <w:tcBorders>
+              <w:top w:val="single" w:sz="4" w:color="D9D9D9"/>
+              <w:left w:val="single" w:sz="4" w:color="D9D9D9"/>
+              <w:bottom w:val="single" w:sz="4" w:color="D9D9D9"/>
+              <w:right w:val="single" w:sz="4" w:color="D9D9D9"/>
+            </w:tcBorders>
+          </w:tcPr>
+          <w:p>
+            <w:pPr>
+              <w:spacing w:after="40" w:line="252" w:lineRule="auto"/>
+            </w:pPr>
+            <w:r>
+              <w:rPr>
+                <w:rFonts w:ascii="Calibri" w:hAnsi="Calibri"/>
+                <w:b w:val="0"/>
+                <w:color w:val="000000"/>
+                <w:sz w:val="18"/>
+              </w:rPr>
+              <w:t>@types/react</w:t>
+            </w:r>
+          </w:p>
+        </w:tc>
+        <w:tc>
+          <w:tcPr>
+            <w:tcW w:type="dxa" w:w="1300"/>
+            <w:vAlign w:val="center"/>
+            <w:tcMar>
+              <w:top w:w="100" w:type="dxa"/>
+              <w:left w:w="100" w:type="dxa"/>
+              <w:bottom w:w="100" w:type="dxa"/>
+              <w:right w:w="100" w:type="dxa"/>
+            </w:tcMar>
+            <w:shd w:fill="FFFFFF"/>
+            <w:tcBorders>
+              <w:top w:val="single" w:sz="4" w:color="D9D9D9"/>
+              <w:left w:val="single" w:sz="4" w:color="D9D9D9"/>
+              <w:bottom w:val="single" w:sz="4" w:color="D9D9D9"/>
+              <w:right w:val="single" w:sz="4" w:color="D9D9D9"/>
+            </w:tcBorders>
+          </w:tcPr>
+          <w:p>
+            <w:pPr>
+              <w:spacing w:after="40" w:line="252" w:lineRule="auto"/>
+              <w:jc w:val="center"/>
+            </w:pPr>
+            <w:r>
+              <w:rPr>
+                <w:rFonts w:ascii="Calibri" w:hAnsi="Calibri"/>
+                <w:b w:val="0"/>
+                <w:color w:val="000000"/>
+                <w:sz w:val="18"/>
+              </w:rPr>
+              <w:t>^19</w:t>
+            </w:r>
+          </w:p>
+        </w:tc>
+        <w:tc>
+          <w:tcPr>
+            <w:tcW w:type="dxa" w:w="1300"/>
+            <w:vAlign w:val="center"/>
+            <w:tcMar>
+              <w:top w:w="100" w:type="dxa"/>
+              <w:left w:w="100" w:type="dxa"/>
+              <w:bottom w:w="100" w:type="dxa"/>
+              <w:right w:w="100" w:type="dxa"/>
+            </w:tcMar>
+            <w:shd w:fill="FFFFFF"/>
+            <w:tcBorders>
+              <w:top w:val="single" w:sz="4" w:color="D9D9D9"/>
+              <w:left w:val="single" w:sz="4" w:color="D9D9D9"/>
+              <w:bottom w:val="single" w:sz="4" w:color="D9D9D9"/>
+              <w:right w:val="single" w:sz="4" w:color="D9D9D9"/>
+            </w:tcBorders>
+          </w:tcPr>
+          <w:p>
+            <w:pPr>
+              <w:spacing w:after="40" w:line="252" w:lineRule="auto"/>
+              <w:jc w:val="center"/>
+            </w:pPr>
+            <w:r>
+              <w:rPr>
+                <w:rFonts w:ascii="Calibri" w:hAnsi="Calibri"/>
+                <w:b w:val="0"/>
+                <w:color w:val="000000"/>
+                <w:sz w:val="18"/>
+              </w:rPr>
+              <w:t>19.2.15</w:t>
+            </w:r>
+          </w:p>
+        </w:tc>
+        <w:tc>
+          <w:tcPr>
+            <w:tcW w:type="dxa" w:w="5500"/>
+            <w:vAlign w:val="center"/>
+            <w:tcMar>
+              <w:top w:w="100" w:type="dxa"/>
+              <w:left w:w="100" w:type="dxa"/>
+              <w:bottom w:w="100" w:type="dxa"/>
+              <w:right w:w="100" w:type="dxa"/>
+            </w:tcMar>
+            <w:shd w:fill="FFFFFF"/>
+            <w:tcBorders>
+              <w:top w:val="single" w:sz="4" w:color="D9D9D9"/>
+              <w:left w:val="single" w:sz="4" w:color="D9D9D9"/>
+              <w:bottom w:val="single" w:sz="4" w:color="D9D9D9"/>
+              <w:right w:val="single" w:sz="4" w:color="D9D9D9"/>
+            </w:tcBorders>
+          </w:tcPr>
+          <w:p>
+            <w:pPr>
+              <w:spacing w:after="40" w:line="252" w:lineRule="auto"/>
+            </w:pPr>
+            <w:r>
+              <w:rPr>
+                <w:rFonts w:ascii="Calibri" w:hAnsi="Calibri"/>
+                <w:b w:val="0"/>
+                <w:color w:val="000000"/>
+                <w:sz w:val="18"/>
+              </w:rPr>
+              <w:t>Definiciones de tipos para edición y análisis; las pantallas actuales usan JavaScript y JSX.</w:t>
+            </w:r>
+          </w:p>
+        </w:tc>
+      </w:tr>
+      <w:tr>
+        <w:trPr>
+          <w:cantSplit/>
+        </w:trPr>
+        <w:tc>
+          <w:tcPr>
+            <w:tcW w:type="dxa" w:w="2200"/>
+            <w:vAlign w:val="center"/>
+            <w:tcMar>
+              <w:top w:w="100" w:type="dxa"/>
+              <w:left w:w="100" w:type="dxa"/>
+              <w:bottom w:w="100" w:type="dxa"/>
+              <w:right w:w="100" w:type="dxa"/>
+            </w:tcMar>
+            <w:shd w:fill="F2F5F8"/>
+            <w:tcBorders>
+              <w:top w:val="single" w:sz="4" w:color="D9D9D9"/>
+              <w:left w:val="single" w:sz="4" w:color="D9D9D9"/>
+              <w:bottom w:val="single" w:sz="4" w:color="D9D9D9"/>
+              <w:right w:val="single" w:sz="4" w:color="D9D9D9"/>
+            </w:tcBorders>
+          </w:tcPr>
+          <w:p>
+            <w:pPr>
+              <w:spacing w:after="40" w:line="252" w:lineRule="auto"/>
+            </w:pPr>
+            <w:r>
+              <w:rPr>
+                <w:rFonts w:ascii="Calibri" w:hAnsi="Calibri"/>
+                <w:b w:val="0"/>
+                <w:color w:val="000000"/>
+                <w:sz w:val="18"/>
+              </w:rPr>
+              <w:t>@types/react-dom</w:t>
+            </w:r>
+          </w:p>
+        </w:tc>
+        <w:tc>
+          <w:tcPr>
+            <w:tcW w:type="dxa" w:w="1300"/>
+            <w:vAlign w:val="center"/>
+            <w:tcMar>
+              <w:top w:w="100" w:type="dxa"/>
+              <w:left w:w="100" w:type="dxa"/>
+              <w:bottom w:w="100" w:type="dxa"/>
+              <w:right w:w="100" w:type="dxa"/>
+            </w:tcMar>
+            <w:shd w:fill="F2F5F8"/>
+            <w:tcBorders>
+              <w:top w:val="single" w:sz="4" w:color="D9D9D9"/>
+              <w:left w:val="single" w:sz="4" w:color="D9D9D9"/>
+              <w:bottom w:val="single" w:sz="4" w:color="D9D9D9"/>
+              <w:right w:val="single" w:sz="4" w:color="D9D9D9"/>
+            </w:tcBorders>
+          </w:tcPr>
+          <w:p>
+            <w:pPr>
+              <w:spacing w:after="40" w:line="252" w:lineRule="auto"/>
+              <w:jc w:val="center"/>
+            </w:pPr>
+            <w:r>
+              <w:rPr>
+                <w:rFonts w:ascii="Calibri" w:hAnsi="Calibri"/>
+                <w:b w:val="0"/>
+                <w:color w:val="000000"/>
+                <w:sz w:val="18"/>
+              </w:rPr>
+              <w:t>^19</w:t>
+            </w:r>
+          </w:p>
+        </w:tc>
+        <w:tc>
+          <w:tcPr>
+            <w:tcW w:type="dxa" w:w="1300"/>
+            <w:vAlign w:val="center"/>
+            <w:tcMar>
+              <w:top w:w="100" w:type="dxa"/>
+              <w:left w:w="100" w:type="dxa"/>
+              <w:bottom w:w="100" w:type="dxa"/>
+              <w:right w:w="100" w:type="dxa"/>
+            </w:tcMar>
+            <w:shd w:fill="F2F5F8"/>
+            <w:tcBorders>
+              <w:top w:val="single" w:sz="4" w:color="D9D9D9"/>
+              <w:left w:val="single" w:sz="4" w:color="D9D9D9"/>
+              <w:bottom w:val="single" w:sz="4" w:color="D9D9D9"/>
+              <w:right w:val="single" w:sz="4" w:color="D9D9D9"/>
+            </w:tcBorders>
+          </w:tcPr>
+          <w:p>
+            <w:pPr>
+              <w:spacing w:after="40" w:line="252" w:lineRule="auto"/>
+              <w:jc w:val="center"/>
+            </w:pPr>
+            <w:r>
+              <w:rPr>
+                <w:rFonts w:ascii="Calibri" w:hAnsi="Calibri"/>
+                <w:b w:val="0"/>
+                <w:color w:val="000000"/>
+                <w:sz w:val="18"/>
+              </w:rPr>
+              <w:t>19.2.3</w:t>
+            </w:r>
+          </w:p>
+        </w:tc>
+        <w:tc>
+          <w:tcPr>
+            <w:tcW w:type="dxa" w:w="5500"/>
+            <w:vAlign w:val="center"/>
+            <w:tcMar>
+              <w:top w:w="100" w:type="dxa"/>
+              <w:left w:w="100" w:type="dxa"/>
+              <w:bottom w:w="100" w:type="dxa"/>
+              <w:right w:w="100" w:type="dxa"/>
+            </w:tcMar>
+            <w:shd w:fill="F2F5F8"/>
+            <w:tcBorders>
+              <w:top w:val="single" w:sz="4" w:color="D9D9D9"/>
+              <w:left w:val="single" w:sz="4" w:color="D9D9D9"/>
+              <w:bottom w:val="single" w:sz="4" w:color="D9D9D9"/>
+              <w:right w:val="single" w:sz="4" w:color="D9D9D9"/>
+            </w:tcBorders>
+          </w:tcPr>
+          <w:p>
+            <w:pPr>
+              <w:spacing w:after="40" w:line="252" w:lineRule="auto"/>
+            </w:pPr>
+            <w:r>
+              <w:rPr>
+                <w:rFonts w:ascii="Calibri" w:hAnsi="Calibri"/>
+                <w:b w:val="0"/>
+                <w:color w:val="000000"/>
+                <w:sz w:val="18"/>
+              </w:rPr>
+              <w:t>Definiciones de tipos de React DOM; no agrega funcionalidad en ejecución.</w:t>
+            </w:r>
+          </w:p>
+        </w:tc>
+      </w:tr>
+    </w:tbl>
+    <w:p xmlns:w="http://schemas.openxmlformats.org/wordprocessingml/2006/main" xmlns:wpc="http://schemas.microsoft.com/office/word/2010/wordprocessingCanvas" xmlns:mo="http://schemas.microsoft.com/office/mac/office/2008/main" xmlns:mc="http://schemas.openxmlformats.org/markup-compatibility/2006" xmlns:mv="urn:schemas-microsoft-com:mac:vml" xmlns:o="urn:schemas-microsoft-com:office:office" xmlns:r="http://schemas.openxmlformats.org/officeDocument/2006/relationships" xmlns:m="http://schemas.openxmlformats.org/officeDocument/2006/math" xmlns:v="urn:schemas-microsoft-com:vml" xmlns:wp14="http://schemas.microsoft.com/office/word/2010/wordprocessingDrawing" xmlns:wp="http://schemas.openxmlformats.org/drawingml/2006/wordprocessingDrawing" xmlns:w10="urn:schemas-microsoft-com:office:word" xmlns:w14="http://schemas.microsoft.com/office/word/2010/wordml" xmlns:wpg="http://schemas.microsoft.com/office/word/2010/wordprocessingGroup" xmlns:wpi="http://schemas.microsoft.com/office/word/2010/wordprocessingInk" xmlns:wne="http://schemas.microsoft.com/office/word/2006/wordml" xmlns:wps="http://schemas.microsoft.com/office/word/2010/wordprocessingShape">
+      <w:pPr>
+        <w:keepNext/>
+        <w:spacing w:after="140" w:line="259" w:lineRule="auto" w:before="200"/>
+      </w:pPr>
+      <w:r>
+        <w:rPr>
+          <w:rFonts w:ascii="Calibri" w:hAnsi="Calibri"/>
+          <w:b/>
+          <w:color w:val="000000"/>
+          <w:sz w:val="24"/>
+        </w:rPr>
+        <w:t>5 4 Integración de las dependencias</w:t>
+      </w:r>
+    </w:p>
+    <w:p xmlns:w="http://schemas.openxmlformats.org/wordprocessingml/2006/main" xmlns:wpc="http://schemas.microsoft.com/office/word/2010/wordprocessingCanvas" xmlns:mo="http://schemas.microsoft.com/office/mac/office/2008/main" xmlns:mc="http://schemas.openxmlformats.org/markup-compatibility/2006" xmlns:mv="urn:schemas-microsoft-com:mac:vml" xmlns:o="urn:schemas-microsoft-com:office:office" xmlns:r="http://schemas.openxmlformats.org/officeDocument/2006/relationships" xmlns:m="http://schemas.openxmlformats.org/officeDocument/2006/math" xmlns:v="urn:schemas-microsoft-com:vml" xmlns:wp14="http://schemas.microsoft.com/office/word/2010/wordprocessingDrawing" xmlns:wp="http://schemas.openxmlformats.org/drawingml/2006/wordprocessingDrawing" xmlns:w10="urn:schemas-microsoft-com:office:word" xmlns:w14="http://schemas.microsoft.com/office/word/2010/wordml" xmlns:wpg="http://schemas.microsoft.com/office/word/2010/wordprocessingGroup" xmlns:wpi="http://schemas.microsoft.com/office/word/2010/wordprocessingInk" xmlns:wne="http://schemas.microsoft.com/office/word/2006/wordml" xmlns:wps="http://schemas.microsoft.com/office/word/2010/wordprocessingShape">
+      <w:pPr>
+        <w:spacing w:after="140" w:line="259" w:lineRule="auto"/>
+      </w:pPr>
+      <w:r>
+        <w:rPr>
+          <w:rFonts w:ascii="Calibri" w:hAnsi="Calibri"/>
+          <w:b w:val="0"/>
+          <w:color w:val="000000"/>
+          <w:sz w:val="21"/>
+        </w:rPr>
+        <w:t>Express recibe las peticiones y aplica Helmet y CORS. El login limita intentos, compara la contraseña con bcryptjs y emite un token con jsonwebtoken. En las rutas protegidas se valida el token antes de consultar Supabase mediante pg. React presenta los resultados y React Router organiza la navegación.</w:t>
+      </w:r>
+    </w:p>
+    <w:p xmlns:w="http://schemas.openxmlformats.org/wordprocessingml/2006/main" xmlns:wpc="http://schemas.microsoft.com/office/word/2010/wordprocessingCanvas" xmlns:mo="http://schemas.microsoft.com/office/mac/office/2008/main" xmlns:mc="http://schemas.openxmlformats.org/markup-compatibility/2006" xmlns:mv="urn:schemas-microsoft-com:mac:vml" xmlns:o="urn:schemas-microsoft-com:office:office" xmlns:r="http://schemas.openxmlformats.org/officeDocument/2006/relationships" xmlns:m="http://schemas.openxmlformats.org/officeDocument/2006/math" xmlns:v="urn:schemas-microsoft-com:vml" xmlns:wp14="http://schemas.microsoft.com/office/word/2010/wordprocessingDrawing" xmlns:wp="http://schemas.openxmlformats.org/drawingml/2006/wordprocessingDrawing" xmlns:w10="urn:schemas-microsoft-com:office:word" xmlns:w14="http://schemas.microsoft.com/office/word/2010/wordml" xmlns:wpg="http://schemas.microsoft.com/office/word/2010/wordprocessingGroup" xmlns:wpi="http://schemas.microsoft.com/office/word/2010/wordprocessingInk" xmlns:wne="http://schemas.microsoft.com/office/word/2006/wordml" xmlns:wps="http://schemas.microsoft.com/office/word/2010/wordprocessingShape">
+      <w:pPr>
+        <w:spacing w:after="140" w:line="259" w:lineRule="auto"/>
+      </w:pPr>
+      <w:r>
+        <w:rPr>
+          <w:rFonts w:ascii="Calibri" w:hAnsi="Calibri"/>
+          <w:b w:val="0"/>
+          <w:color w:val="000000"/>
+          <w:sz w:val="21"/>
+        </w:rPr>
+        <w:t>El cliente HTTP usa fetch y guarda el token en sessionStorage, ambas API del navegador. No requiere Axios. La aplicación utiliza pg para acceder a Supabase y no declara su SDK como dependencia directa.</w:t>
+      </w:r>
+    </w:p>
+    <w:p xmlns:w="http://schemas.openxmlformats.org/wordprocessingml/2006/main" xmlns:wpc="http://schemas.microsoft.com/office/word/2010/wordprocessingCanvas" xmlns:mo="http://schemas.microsoft.com/office/mac/office/2008/main" xmlns:mc="http://schemas.openxmlformats.org/markup-compatibility/2006" xmlns:mv="urn:schemas-microsoft-com:mac:vml" xmlns:o="urn:schemas-microsoft-com:office:office" xmlns:r="http://schemas.openxmlformats.org/officeDocument/2006/relationships" xmlns:m="http://schemas.openxmlformats.org/officeDocument/2006/math" xmlns:v="urn:schemas-microsoft-com:vml" xmlns:wp14="http://schemas.microsoft.com/office/word/2010/wordprocessingDrawing" xmlns:wp="http://schemas.openxmlformats.org/drawingml/2006/wordprocessingDrawing" xmlns:w10="urn:schemas-microsoft-com:office:word" xmlns:w14="http://schemas.microsoft.com/office/word/2010/wordml" xmlns:wpg="http://schemas.microsoft.com/office/word/2010/wordprocessingGroup" xmlns:wpi="http://schemas.microsoft.com/office/word/2010/wordprocessingInk" xmlns:wne="http://schemas.microsoft.com/office/word/2006/wordml" xmlns:wps="http://schemas.microsoft.com/office/word/2010/wordprocessingShape">
+      <w:pPr>
+        <w:spacing w:after="140" w:line="259" w:lineRule="auto"/>
+      </w:pPr>
+      <w:r>
+        <w:rPr>
+          <w:rFonts w:ascii="Calibri" w:hAnsi="Calibri"/>
+          <w:b w:val="0"/>
+          <w:color w:val="000000"/>
+          <w:sz w:val="21"/>
+        </w:rPr>
+        <w:t>Node.js y npm son el entorno y administrador de paquetes. El Blueprint de Render declara Node.js 22. Supabase, Render y Vercel son servicios externos, no paquetes npm. El login actual valida las credenciales del entorno; la tabla usuarios no interviene en ese flujo.</w:t>
+      </w:r>
+    </w:p>
+    <w:p xmlns:w="http://schemas.openxmlformats.org/wordprocessingml/2006/main" xmlns:wpc="http://schemas.microsoft.com/office/word/2010/wordprocessingCanvas" xmlns:mo="http://schemas.microsoft.com/office/mac/office/2008/main" xmlns:mc="http://schemas.openxmlformats.org/markup-compatibility/2006" xmlns:mv="urn:schemas-microsoft-com:mac:vml" xmlns:o="urn:schemas-microsoft-com:office:office" xmlns:r="http://schemas.openxmlformats.org/officeDocument/2006/relationships" xmlns:m="http://schemas.openxmlformats.org/officeDocument/2006/math" xmlns:v="urn:schemas-microsoft-com:vml" xmlns:wp14="http://schemas.microsoft.com/office/word/2010/wordprocessingDrawing" xmlns:wp="http://schemas.openxmlformats.org/drawingml/2006/wordprocessingDrawing" xmlns:w10="urn:schemas-microsoft-com:office:word" xmlns:w14="http://schemas.microsoft.com/office/word/2010/wordml" xmlns:wpg="http://schemas.microsoft.com/office/word/2010/wordprocessingGroup" xmlns:wpi="http://schemas.microsoft.com/office/word/2010/wordprocessingInk" xmlns:wne="http://schemas.microsoft.com/office/word/2006/wordml" xmlns:wps="http://schemas.microsoft.com/office/word/2010/wordprocessingShape">
+      <w:pPr>
+        <w:keepNext/>
+        <w:spacing w:after="140" w:line="259" w:lineRule="auto" w:before="200"/>
+      </w:pPr>
+      <w:r>
+        <w:rPr>
+          <w:rFonts w:ascii="Calibri" w:hAnsi="Calibri"/>
+          <w:b/>
+          <w:color w:val="000000"/>
+          <w:sz w:val="24"/>
+        </w:rPr>
+        <w:t>5 5 Instalación y comandos</w:t>
+      </w:r>
+    </w:p>
+    <w:p xmlns:w="http://schemas.openxmlformats.org/wordprocessingml/2006/main" xmlns:wpc="http://schemas.microsoft.com/office/word/2010/wordprocessingCanvas" xmlns:mo="http://schemas.microsoft.com/office/mac/office/2008/main" xmlns:mc="http://schemas.openxmlformats.org/markup-compatibility/2006" xmlns:mv="urn:schemas-microsoft-com:mac:vml" xmlns:o="urn:schemas-microsoft-com:office:office" xmlns:r="http://schemas.openxmlformats.org/officeDocument/2006/relationships" xmlns:m="http://schemas.openxmlformats.org/officeDocument/2006/math" xmlns:v="urn:schemas-microsoft-com:vml" xmlns:wp14="http://schemas.microsoft.com/office/word/2010/wordprocessingDrawing" xmlns:wp="http://schemas.openxmlformats.org/drawingml/2006/wordprocessingDrawing" xmlns:w10="urn:schemas-microsoft-com:office:word" xmlns:w14="http://schemas.microsoft.com/office/word/2010/wordml" xmlns:wpg="http://schemas.microsoft.com/office/word/2010/wordprocessingGroup" xmlns:wpi="http://schemas.microsoft.com/office/word/2010/wordprocessingInk" xmlns:wne="http://schemas.microsoft.com/office/word/2006/wordml" xmlns:wps="http://schemas.microsoft.com/office/word/2010/wordprocessingShape">
+      <w:pPr>
+        <w:spacing w:after="140" w:line="259" w:lineRule="auto"/>
+      </w:pPr>
+      <w:r>
+        <w:rPr>
+          <w:rFonts w:ascii="Calibri" w:hAnsi="Calibri"/>
+          <w:b w:val="0"/>
+          <w:color w:val="000000"/>
+          <w:sz w:val="21"/>
+        </w:rPr>
+        <w:t>Desde la raíz del repositorio, instalar las versiones fijadas con npm ci --prefix Backend y npm ci --prefix Frontend. Las variables de entorno y el esquema SQL deben configurarse por separado, según el README.</w:t>
+      </w:r>
+    </w:p>
+    <w:p xmlns:w="http://schemas.openxmlformats.org/wordprocessingml/2006/main" xmlns:wpc="http://schemas.microsoft.com/office/word/2010/wordprocessingCanvas" xmlns:mo="http://schemas.microsoft.com/office/mac/office/2008/main" xmlns:mc="http://schemas.openxmlformats.org/markup-compatibility/2006" xmlns:mv="urn:schemas-microsoft-com:mac:vml" xmlns:o="urn:schemas-microsoft-com:office:office" xmlns:r="http://schemas.openxmlformats.org/officeDocument/2006/relationships" xmlns:m="http://schemas.openxmlformats.org/officeDocument/2006/math" xmlns:v="urn:schemas-microsoft-com:vml" xmlns:wp14="http://schemas.microsoft.com/office/word/2010/wordprocessingDrawing" xmlns:wp="http://schemas.openxmlformats.org/drawingml/2006/wordprocessingDrawing" xmlns:w10="urn:schemas-microsoft-com:office:word" xmlns:w14="http://schemas.microsoft.com/office/word/2010/wordml" xmlns:wpg="http://schemas.microsoft.com/office/word/2010/wordprocessingGroup" xmlns:wpi="http://schemas.microsoft.com/office/word/2010/wordprocessingInk" xmlns:wne="http://schemas.microsoft.com/office/word/2006/wordml" xmlns:wps="http://schemas.microsoft.com/office/word/2010/wordprocessingShape">
+      <w:pPr>
+        <w:spacing w:after="140" w:line="259" w:lineRule="auto"/>
+      </w:pPr>
+      <w:r>
+        <w:rPr>
+          <w:rFonts w:ascii="Calibri" w:hAnsi="Calibri"/>
+          <w:b w:val="0"/>
+          <w:color w:val="000000"/>
+          <w:sz w:val="21"/>
+        </w:rPr>
+        <w:t>Backend en desarrollo: npm run dev --prefix Backend. Usa el modo de observación nativo de Node.js; no requiere nodemon.</w:t>
+      </w:r>
+    </w:p>
+    <w:p xmlns:w="http://schemas.openxmlformats.org/wordprocessingml/2006/main" xmlns:wpc="http://schemas.microsoft.com/office/word/2010/wordprocessingCanvas" xmlns:mo="http://schemas.microsoft.com/office/mac/office/2008/main" xmlns:mc="http://schemas.openxmlformats.org/markup-compatibility/2006" xmlns:mv="urn:schemas-microsoft-com:mac:vml" xmlns:o="urn:schemas-microsoft-com:office:office" xmlns:r="http://schemas.openxmlformats.org/officeDocument/2006/relationships" xmlns:m="http://schemas.openxmlformats.org/officeDocument/2006/math" xmlns:v="urn:schemas-microsoft-com:vml" xmlns:wp14="http://schemas.microsoft.com/office/word/2010/wordprocessingDrawing" xmlns:wp="http://schemas.openxmlformats.org/drawingml/2006/wordprocessingDrawing" xmlns:w10="urn:schemas-microsoft-com:office:word" xmlns:w14="http://schemas.microsoft.com/office/word/2010/wordml" xmlns:wpg="http://schemas.microsoft.com/office/word/2010/wordprocessingGroup" xmlns:wpi="http://schemas.microsoft.com/office/word/2010/wordprocessingInk" xmlns:wne="http://schemas.microsoft.com/office/word/2006/wordml" xmlns:wps="http://schemas.microsoft.com/office/word/2010/wordprocessingShape">
+      <w:pPr>
+        <w:spacing w:after="140" w:line="259" w:lineRule="auto"/>
+      </w:pPr>
+      <w:r>
+        <w:rPr>
+          <w:rFonts w:ascii="Calibri" w:hAnsi="Calibri"/>
+          <w:b w:val="0"/>
+          <w:color w:val="000000"/>
+          <w:sz w:val="21"/>
+        </w:rPr>
+        <w:t>Backend en producción: npm start --prefix Backend. En Render, con directorio raíz Backend, usar npm start.</w:t>
+      </w:r>
+    </w:p>
+    <w:p xmlns:w="http://schemas.openxmlformats.org/wordprocessingml/2006/main" xmlns:wpc="http://schemas.microsoft.com/office/word/2010/wordprocessingCanvas" xmlns:mo="http://schemas.microsoft.com/office/mac/office/2008/main" xmlns:mc="http://schemas.openxmlformats.org/markup-compatibility/2006" xmlns:mv="urn:schemas-microsoft-com:mac:vml" xmlns:o="urn:schemas-microsoft-com:office:office" xmlns:r="http://schemas.openxmlformats.org/officeDocument/2006/relationships" xmlns:m="http://schemas.openxmlformats.org/officeDocument/2006/math" xmlns:v="urn:schemas-microsoft-com:vml" xmlns:wp14="http://schemas.microsoft.com/office/word/2010/wordprocessingDrawing" xmlns:wp="http://schemas.openxmlformats.org/drawingml/2006/wordprocessingDrawing" xmlns:w10="urn:schemas-microsoft-com:office:word" xmlns:w14="http://schemas.microsoft.com/office/word/2010/wordml" xmlns:wpg="http://schemas.microsoft.com/office/word/2010/wordprocessingGroup" xmlns:wpi="http://schemas.microsoft.com/office/word/2010/wordprocessingInk" xmlns:wne="http://schemas.microsoft.com/office/word/2006/wordml" xmlns:wps="http://schemas.microsoft.com/office/word/2010/wordprocessingShape">
+      <w:pPr>
+        <w:spacing w:after="140" w:line="259" w:lineRule="auto"/>
+      </w:pPr>
+      <w:r>
+        <w:rPr>
+          <w:rFonts w:ascii="Calibri" w:hAnsi="Calibri"/>
+          <w:b w:val="0"/>
+          <w:color w:val="000000"/>
+          <w:sz w:val="21"/>
+        </w:rPr>
+        <w:t>Frontend en desarrollo: npm run dev --prefix Frontend.</w:t>
+      </w:r>
+    </w:p>
+    <w:p xmlns:w="http://schemas.openxmlformats.org/wordprocessingml/2006/main" xmlns:wpc="http://schemas.microsoft.com/office/word/2010/wordprocessingCanvas" xmlns:mo="http://schemas.microsoft.com/office/mac/office/2008/main" xmlns:mc="http://schemas.openxmlformats.org/markup-compatibility/2006" xmlns:mv="urn:schemas-microsoft-com:mac:vml" xmlns:o="urn:schemas-microsoft-com:office:office" xmlns:r="http://schemas.openxmlformats.org/officeDocument/2006/relationships" xmlns:m="http://schemas.openxmlformats.org/officeDocument/2006/math" xmlns:v="urn:schemas-microsoft-com:vml" xmlns:wp14="http://schemas.microsoft.com/office/word/2010/wordprocessingDrawing" xmlns:wp="http://schemas.openxmlformats.org/drawingml/2006/wordprocessingDrawing" xmlns:w10="urn:schemas-microsoft-com:office:word" xmlns:w14="http://schemas.microsoft.com/office/word/2010/wordml" xmlns:wpg="http://schemas.microsoft.com/office/word/2010/wordprocessingGroup" xmlns:wpi="http://schemas.microsoft.com/office/word/2010/wordprocessingInk" xmlns:wne="http://schemas.microsoft.com/office/word/2006/wordml" xmlns:wps="http://schemas.microsoft.com/office/word/2010/wordprocessingShape">
+      <w:pPr>
+        <w:spacing w:after="140" w:line="259" w:lineRule="auto"/>
+      </w:pPr>
+      <w:r>
+        <w:rPr>
+          <w:rFonts w:ascii="Calibri" w:hAnsi="Calibri"/>
+          <w:b w:val="0"/>
+          <w:color w:val="000000"/>
+          <w:sz w:val="21"/>
+        </w:rPr>
+        <w:t>Compilación: npm run build --prefix Frontend. Genera Frontend/dist.</w:t>
+      </w:r>
+    </w:p>
+    <w:p xmlns:w="http://schemas.openxmlformats.org/wordprocessingml/2006/main" xmlns:wpc="http://schemas.microsoft.com/office/word/2010/wordprocessingCanvas" xmlns:mo="http://schemas.microsoft.com/office/mac/office/2008/main" xmlns:mc="http://schemas.openxmlformats.org/markup-compatibility/2006" xmlns:mv="urn:schemas-microsoft-com:mac:vml" xmlns:o="urn:schemas-microsoft-com:office:office" xmlns:r="http://schemas.openxmlformats.org/officeDocument/2006/relationships" xmlns:m="http://schemas.openxmlformats.org/officeDocument/2006/math" xmlns:v="urn:schemas-microsoft-com:vml" xmlns:wp14="http://schemas.microsoft.com/office/word/2010/wordprocessingDrawing" xmlns:wp="http://schemas.openxmlformats.org/drawingml/2006/wordprocessingDrawing" xmlns:w10="urn:schemas-microsoft-com:office:word" xmlns:w14="http://schemas.microsoft.com/office/word/2010/wordml" xmlns:wpg="http://schemas.microsoft.com/office/word/2010/wordprocessingGroup" xmlns:wpi="http://schemas.microsoft.com/office/word/2010/wordprocessingInk" xmlns:wne="http://schemas.microsoft.com/office/word/2006/wordml" xmlns:wps="http://schemas.microsoft.com/office/word/2010/wordprocessingShape">
+      <w:pPr>
+        <w:spacing w:after="140" w:line="259" w:lineRule="auto"/>
+      </w:pPr>
+      <w:r>
+        <w:rPr>
+          <w:rFonts w:ascii="Calibri" w:hAnsi="Calibri"/>
+          <w:b w:val="0"/>
+          <w:color w:val="000000"/>
+          <w:sz w:val="21"/>
+        </w:rPr>
+        <w:t>Previsualización: npm run preview --prefix Frontend. El proxy local de desarrollo no está configurado para preview.</w:t>
+      </w:r>
+    </w:p>
+    <w:p xmlns:w="http://schemas.openxmlformats.org/wordprocessingml/2006/main" xmlns:wpc="http://schemas.microsoft.com/office/word/2010/wordprocessingCanvas" xmlns:mo="http://schemas.microsoft.com/office/mac/office/2008/main" xmlns:mc="http://schemas.openxmlformats.org/markup-compatibility/2006" xmlns:mv="urn:schemas-microsoft-com:mac:vml" xmlns:o="urn:schemas-microsoft-com:office:office" xmlns:r="http://schemas.openxmlformats.org/officeDocument/2006/relationships" xmlns:m="http://schemas.openxmlformats.org/officeDocument/2006/math" xmlns:v="urn:schemas-microsoft-com:vml" xmlns:wp14="http://schemas.microsoft.com/office/word/2010/wordprocessingDrawing" xmlns:wp="http://schemas.openxmlformats.org/drawingml/2006/wordprocessingDrawing" xmlns:w10="urn:schemas-microsoft-com:office:word" xmlns:w14="http://schemas.microsoft.com/office/word/2010/wordml" xmlns:wpg="http://schemas.microsoft.com/office/word/2010/wordprocessingGroup" xmlns:wpi="http://schemas.microsoft.com/office/word/2010/wordprocessingInk" xmlns:wne="http://schemas.microsoft.com/office/word/2006/wordml" xmlns:wps="http://schemas.microsoft.com/office/word/2010/wordprocessingShape">
+      <w:pPr>
+        <w:keepNext/>
+        <w:spacing w:after="140" w:line="259" w:lineRule="auto" w:before="200"/>
+      </w:pPr>
+      <w:r>
+        <w:rPr>
+          <w:rFonts w:ascii="Calibri" w:hAnsi="Calibri"/>
+          <w:b/>
+          <w:color w:val="000000"/>
+          <w:sz w:val="24"/>
+        </w:rPr>
+        <w:t>5 6 Versiones y mantenimiento</w:t>
+      </w:r>
+    </w:p>
+    <w:p xmlns:w="http://schemas.openxmlformats.org/wordprocessingml/2006/main" xmlns:wpc="http://schemas.microsoft.com/office/word/2010/wordprocessingCanvas" xmlns:mo="http://schemas.microsoft.com/office/mac/office/2008/main" xmlns:mc="http://schemas.openxmlformats.org/markup-compatibility/2006" xmlns:mv="urn:schemas-microsoft-com:mac:vml" xmlns:o="urn:schemas-microsoft-com:office:office" xmlns:r="http://schemas.openxmlformats.org/officeDocument/2006/relationships" xmlns:m="http://schemas.openxmlformats.org/officeDocument/2006/math" xmlns:v="urn:schemas-microsoft-com:vml" xmlns:wp14="http://schemas.microsoft.com/office/word/2010/wordprocessingDrawing" xmlns:wp="http://schemas.openxmlformats.org/drawingml/2006/wordprocessingDrawing" xmlns:w10="urn:schemas-microsoft-com:office:word" xmlns:w14="http://schemas.microsoft.com/office/word/2010/wordml" xmlns:wpg="http://schemas.microsoft.com/office/word/2010/wordprocessingGroup" xmlns:wpi="http://schemas.microsoft.com/office/word/2010/wordprocessingInk" xmlns:wne="http://schemas.microsoft.com/office/word/2006/wordml" xmlns:wps="http://schemas.microsoft.com/office/word/2010/wordprocessingShape">
+      <w:pPr>
+        <w:spacing w:after="140" w:line="259" w:lineRule="auto"/>
+      </w:pPr>
+      <w:r>
+        <w:rPr>
+          <w:rFonts w:ascii="Calibri" w:hAnsi="Calibri"/>
+          <w:b w:val="0"/>
+          <w:color w:val="000000"/>
+          <w:sz w:val="21"/>
+        </w:rPr>
+        <w:t>La versión declarada es el rango de package.json; la fijada pertenece a package-lock.json. El prefijo ^ permite actualizaciones dentro de la misma versión mayor para estos paquetes. Por ejemplo, Express declara ^4.22.2 y fija 4.22.3. Las dependencias transitivas quedan registradas en los archivos de bloqueo.</w:t>
+      </w:r>
+    </w:p>
+    <w:p xmlns:w="http://schemas.openxmlformats.org/wordprocessingml/2006/main" xmlns:wpc="http://schemas.microsoft.com/office/word/2010/wordprocessingCanvas" xmlns:mo="http://schemas.microsoft.com/office/mac/office/2008/main" xmlns:mc="http://schemas.openxmlformats.org/markup-compatibility/2006" xmlns:mv="urn:schemas-microsoft-com:mac:vml" xmlns:o="urn:schemas-microsoft-com:office:office" xmlns:r="http://schemas.openxmlformats.org/officeDocument/2006/relationships" xmlns:m="http://schemas.openxmlformats.org/officeDocument/2006/math" xmlns:v="urn:schemas-microsoft-com:vml" xmlns:wp14="http://schemas.microsoft.com/office/word/2010/wordprocessingDrawing" xmlns:wp="http://schemas.openxmlformats.org/drawingml/2006/wordprocessingDrawing" xmlns:w10="urn:schemas-microsoft-com:office:word" xmlns:w14="http://schemas.microsoft.com/office/word/2010/wordml" xmlns:wpg="http://schemas.microsoft.com/office/word/2010/wordprocessingGroup" xmlns:wpi="http://schemas.microsoft.com/office/word/2010/wordprocessingInk" xmlns:wne="http://schemas.microsoft.com/office/word/2006/wordml" xmlns:wps="http://schemas.microsoft.com/office/word/2010/wordprocessingShape">
+      <w:pPr>
+        <w:spacing w:after="140" w:line="259" w:lineRule="auto"/>
+      </w:pPr>
+      <w:r>
+        <w:rPr>
+          <w:rFonts w:ascii="Calibri" w:hAnsi="Calibri"/>
+          <w:b w:val="0"/>
+          <w:color w:val="000000"/>
+          <w:sz w:val="21"/>
+        </w:rPr>
+        <w:t>npm ci requiere coherencia entre ambos archivos y reemplaza node_modules. Al actualizar paquetes, guardar package.json y package-lock.json del componente afectado. Los despliegues usan npm; Bun no es necesario para ese procedimiento, aunque existan archivos bun.lock.</w:t>
+      </w:r>
+    </w:p>
+    <w:p xmlns:w="http://schemas.openxmlformats.org/wordprocessingml/2006/main" xmlns:wpc="http://schemas.microsoft.com/office/word/2010/wordprocessingCanvas" xmlns:mo="http://schemas.microsoft.com/office/mac/office/2008/main" xmlns:mc="http://schemas.openxmlformats.org/markup-compatibility/2006" xmlns:mv="urn:schemas-microsoft-com:mac:vml" xmlns:o="urn:schemas-microsoft-com:office:office" xmlns:r="http://schemas.openxmlformats.org/officeDocument/2006/relationships" xmlns:m="http://schemas.openxmlformats.org/officeDocument/2006/math" xmlns:v="urn:schemas-microsoft-com:vml" xmlns:wp14="http://schemas.microsoft.com/office/word/2010/wordprocessingDrawing" xmlns:wp="http://schemas.openxmlformats.org/drawingml/2006/wordprocessingDrawing" xmlns:w10="urn:schemas-microsoft-com:office:word" xmlns:w14="http://schemas.microsoft.com/office/word/2010/wordml" xmlns:wpg="http://schemas.microsoft.com/office/word/2010/wordprocessingGroup" xmlns:wpi="http://schemas.microsoft.com/office/word/2010/wordprocessingInk" xmlns:wne="http://schemas.microsoft.com/office/word/2006/wordml" xmlns:wps="http://schemas.microsoft.com/office/word/2010/wordprocessingShape">
+      <w:pPr>
+        <w:spacing w:after="140" w:line="259" w:lineRule="auto"/>
+      </w:pPr>
+      <w:r>
+        <w:rPr>
+          <w:rFonts w:ascii="Calibri" w:hAnsi="Calibri"/>
+          <w:b w:val="0"/>
+          <w:color w:val="000000"/>
+          <w:sz w:val="21"/>
+        </w:rPr>
+        <w:t>Para revisar versiones y avisos se pueden ejecutar npm outdated y npm audit dentro de Backend y Frontend. Antes de desplegar actualizaciones, revisar compatibilidad, compilar y repetir las pruebas de autenticación, consultas, altas, préstamos y devoluciones. Actualmente no hay una suite automatizada ni comandos npm test.</w:t>
+      </w:r>
+    </w:p>
     <w:sectPr>
       <w:pgSz w:w="12240" w:h="15840" w:orient="portrait"/>
       <w:pgMar w:top="1440" w:right="1440" w:bottom="1440" w:left="1440" w:header="708" w:footer="708" w:gutter="0"/>

</xml_diff>